<commit_message>
Updated Dart fundamentals notes
</commit_message>
<xml_diff>
--- a/Dart Basics.docx
+++ b/Dart Basics.docx
@@ -6,7 +6,6 @@
       <w:r>
         <w:t xml:space="preserve">Topic 1: </w:t>
       </w:r>
-      <w:proofErr w:type="gramStart"/>
       <w:r>
         <w:rPr>
           <w:color w:val="EE0000"/>
@@ -17,40 +16,12 @@
         <w:t>,,,</w:t>
       </w:r>
       <w:r>
-        <w:t>Variable</w:t>
-      </w:r>
-      <w:proofErr w:type="gramEnd"/>
-      <w:r>
-        <w:t xml:space="preserve"> Kya Hota H?</w:t>
-      </w:r>
-    </w:p>
-    <w:p>
-      <w:r>
-        <w:t xml:space="preserve">Variable ek container/storage </w:t>
-      </w:r>
-      <w:proofErr w:type="spellStart"/>
-      <w:r>
-        <w:t>hota</w:t>
-      </w:r>
-      <w:proofErr w:type="spellEnd"/>
-      <w:r>
-        <w:t xml:space="preserve"> h </w:t>
-      </w:r>
-      <w:proofErr w:type="spellStart"/>
-      <w:r>
-        <w:t>jisme</w:t>
-      </w:r>
-      <w:proofErr w:type="spellEnd"/>
-      <w:r>
-        <w:t xml:space="preserve"> data store </w:t>
-      </w:r>
-      <w:proofErr w:type="spellStart"/>
-      <w:r>
-        <w:t>karte</w:t>
-      </w:r>
-      <w:proofErr w:type="spellEnd"/>
-      <w:r>
-        <w:t xml:space="preserve"> h.</w:t>
+        <w:t>Variable Kya Hota H?</w:t>
+      </w:r>
+    </w:p>
+    <w:p>
+      <w:r>
+        <w:t>Variable ek container/storage hota h jisme data store karte h.</w:t>
       </w:r>
     </w:p>
     <w:p>
@@ -92,18 +63,8 @@
       </w:r>
     </w:p>
     <w:p>
-      <w:proofErr w:type="spellStart"/>
-      <w:proofErr w:type="gramStart"/>
-      <w:r>
-        <w:t>e.g</w:t>
-      </w:r>
-      <w:proofErr w:type="spellEnd"/>
-      <w:r>
-        <w:t xml:space="preserve">  ----</w:t>
-      </w:r>
-      <w:proofErr w:type="gramEnd"/>
-      <w:r>
-        <w:t xml:space="preserve">   </w:t>
+      <w:r>
+        <w:t xml:space="preserve">e.g  ----   </w:t>
       </w:r>
       <w:r>
         <w:t>var name = "Kartik";</w:t>
@@ -194,15 +155,7 @@
         </w:numPr>
       </w:pPr>
       <w:r>
-        <w:t xml:space="preserve">value runtime pe assign ho </w:t>
-      </w:r>
-      <w:proofErr w:type="spellStart"/>
-      <w:r>
-        <w:t>sakti</w:t>
-      </w:r>
-      <w:proofErr w:type="spellEnd"/>
-      <w:r>
-        <w:t xml:space="preserve"> h </w:t>
+        <w:t xml:space="preserve">value runtime pe assign ho sakti h </w:t>
       </w:r>
     </w:p>
     <w:p>
@@ -213,57 +166,12 @@
         </w:numPr>
       </w:pPr>
       <w:r>
-        <w:t xml:space="preserve">ek </w:t>
-      </w:r>
-      <w:proofErr w:type="spellStart"/>
-      <w:r>
-        <w:t>baar</w:t>
-      </w:r>
-      <w:proofErr w:type="spellEnd"/>
-      <w:r>
-        <w:t xml:space="preserve"> assign hone </w:t>
-      </w:r>
-      <w:proofErr w:type="spellStart"/>
-      <w:r>
-        <w:t>ke</w:t>
-      </w:r>
-      <w:proofErr w:type="spellEnd"/>
-      <w:r>
-        <w:t xml:space="preserve"> </w:t>
-      </w:r>
-      <w:proofErr w:type="spellStart"/>
-      <w:r>
-        <w:t>baad</w:t>
-      </w:r>
-      <w:proofErr w:type="spellEnd"/>
-      <w:r>
-        <w:t xml:space="preserve"> change </w:t>
-      </w:r>
-      <w:proofErr w:type="spellStart"/>
-      <w:r>
-        <w:t>nahi</w:t>
-      </w:r>
-      <w:proofErr w:type="spellEnd"/>
-      <w:r>
-        <w:t xml:space="preserve"> </w:t>
-      </w:r>
-      <w:proofErr w:type="spellStart"/>
-      <w:r>
-        <w:t>hoti</w:t>
-      </w:r>
-      <w:proofErr w:type="spellEnd"/>
-    </w:p>
-    <w:p>
-      <w:r>
-        <w:t xml:space="preserve"> </w:t>
-      </w:r>
-      <w:proofErr w:type="spellStart"/>
-      <w:r>
-        <w:t>eg.</w:t>
-      </w:r>
-      <w:proofErr w:type="spellEnd"/>
-      <w:r>
-        <w:t xml:space="preserve">   </w:t>
+        <w:t>ek baar assign hone ke baad change nahi hoti</w:t>
+      </w:r>
+    </w:p>
+    <w:p>
+      <w:r>
+        <w:t xml:space="preserve"> eg.   </w:t>
       </w:r>
       <w:r>
         <w:t>final name = "Kartik";</w:t>
@@ -271,27 +179,14 @@
     </w:p>
     <w:p>
       <w:r>
-        <w:t xml:space="preserve">used </w:t>
-      </w:r>
-      <w:proofErr w:type="gramStart"/>
-      <w:r>
-        <w:t xml:space="preserve">in  </w:t>
-      </w:r>
-      <w:r>
-        <w:t></w:t>
-      </w:r>
-      <w:proofErr w:type="gramEnd"/>
-      <w:r>
-        <w:t xml:space="preserve">  API </w:t>
-      </w:r>
-      <w:proofErr w:type="gramStart"/>
-      <w:r>
-        <w:t xml:space="preserve">data </w:t>
+        <w:t xml:space="preserve">used in  </w:t>
+      </w:r>
+      <w:r>
+        <w:t xml:space="preserve">  API data </w:t>
       </w:r>
       <w:r>
         <w:t>,</w:t>
       </w:r>
-      <w:proofErr w:type="gramEnd"/>
       <w:r>
         <w:t xml:space="preserve"> controller</w:t>
       </w:r>
@@ -299,16 +194,11 @@
         <w:t>,</w:t>
       </w:r>
       <w:r>
-        <w:t xml:space="preserve"> runtime </w:t>
-      </w:r>
-      <w:proofErr w:type="gramStart"/>
-      <w:r>
-        <w:t xml:space="preserve">values </w:t>
+        <w:t xml:space="preserve"> runtime values </w:t>
       </w:r>
       <w:r>
         <w:t>,</w:t>
       </w:r>
-      <w:proofErr w:type="gramEnd"/>
       <w:r>
         <w:t xml:space="preserve"> objects</w:t>
       </w:r>
@@ -379,79 +269,28 @@
         <w:rPr>
           <w:color w:val="000000" w:themeColor="text1"/>
         </w:rPr>
-        <w:t xml:space="preserve">value </w:t>
-      </w:r>
-      <w:proofErr w:type="spellStart"/>
-      <w:r>
-        <w:rPr>
-          <w:color w:val="000000" w:themeColor="text1"/>
-        </w:rPr>
-        <w:t>pehle</w:t>
-      </w:r>
-      <w:proofErr w:type="spellEnd"/>
-      <w:r>
-        <w:rPr>
-          <w:color w:val="000000" w:themeColor="text1"/>
-        </w:rPr>
-        <w:t xml:space="preserve"> se fixed </w:t>
-      </w:r>
-      <w:proofErr w:type="spellStart"/>
-      <w:r>
-        <w:rPr>
-          <w:color w:val="000000" w:themeColor="text1"/>
-        </w:rPr>
-        <w:t>honi</w:t>
-      </w:r>
-      <w:proofErr w:type="spellEnd"/>
-      <w:r>
-        <w:rPr>
-          <w:color w:val="000000" w:themeColor="text1"/>
-        </w:rPr>
-        <w:t xml:space="preserve"> </w:t>
-      </w:r>
-      <w:proofErr w:type="spellStart"/>
-      <w:r>
-        <w:rPr>
-          <w:color w:val="000000" w:themeColor="text1"/>
-        </w:rPr>
-        <w:t>chahiye</w:t>
-      </w:r>
-      <w:proofErr w:type="spellEnd"/>
-    </w:p>
-    <w:p>
-      <w:pPr>
-        <w:rPr>
-          <w:b/>
-          <w:bCs/>
-          <w:color w:val="000000" w:themeColor="text1"/>
-        </w:rPr>
-      </w:pPr>
-      <w:proofErr w:type="spellStart"/>
-      <w:r>
-        <w:rPr>
-          <w:color w:val="000000" w:themeColor="text1"/>
-        </w:rPr>
-        <w:t>eg</w:t>
-      </w:r>
-      <w:proofErr w:type="spellEnd"/>
-      <w:r>
-        <w:rPr>
-          <w:color w:val="000000" w:themeColor="text1"/>
-        </w:rPr>
-        <w:t xml:space="preserve">   </w:t>
-      </w:r>
-      <w:r>
-        <w:rPr>
-          <w:color w:val="000000" w:themeColor="text1"/>
-        </w:rPr>
-        <w:t>const pi = 3.14</w:t>
-      </w:r>
-      <w:proofErr w:type="gramStart"/>
-      <w:r>
-        <w:rPr>
-          <w:color w:val="000000" w:themeColor="text1"/>
-        </w:rPr>
-        <w:t>;</w:t>
+        <w:t>value pehle se fixed honi chahiye</w:t>
+      </w:r>
+    </w:p>
+    <w:p>
+      <w:pPr>
+        <w:rPr>
+          <w:b/>
+          <w:bCs/>
+          <w:color w:val="000000" w:themeColor="text1"/>
+        </w:rPr>
+      </w:pPr>
+      <w:r>
+        <w:rPr>
+          <w:color w:val="000000" w:themeColor="text1"/>
+        </w:rPr>
+        <w:t xml:space="preserve">eg   </w:t>
+      </w:r>
+      <w:r>
+        <w:rPr>
+          <w:color w:val="000000" w:themeColor="text1"/>
+        </w:rPr>
+        <w:t>const pi = 3.14;</w:t>
       </w:r>
       <w:r>
         <w:rPr>
@@ -465,16 +304,7 @@
           <w:bCs/>
           <w:color w:val="000000" w:themeColor="text1"/>
         </w:rPr>
-        <w:t>Use</w:t>
-      </w:r>
-      <w:proofErr w:type="gramEnd"/>
-      <w:r>
-        <w:rPr>
-          <w:b/>
-          <w:bCs/>
-          <w:color w:val="000000" w:themeColor="text1"/>
-        </w:rPr>
-        <w:t xml:space="preserve"> Case</w:t>
+        <w:t>Use Case</w:t>
       </w:r>
     </w:p>
     <w:p>
@@ -565,168 +395,318 @@
         <w:rPr>
           <w:color w:val="000000" w:themeColor="text1"/>
         </w:rPr>
-        <w:t xml:space="preserve">Variable ko string </w:t>
-      </w:r>
-      <w:proofErr w:type="spellStart"/>
-      <w:r>
-        <w:rPr>
-          <w:color w:val="000000" w:themeColor="text1"/>
-        </w:rPr>
-        <w:t>ke</w:t>
-      </w:r>
-      <w:proofErr w:type="spellEnd"/>
-      <w:r>
-        <w:rPr>
-          <w:color w:val="000000" w:themeColor="text1"/>
+        <w:t>Variable ko string ke andar use karna.</w:t>
+      </w:r>
+    </w:p>
+    <w:p>
+      <w:pPr>
+        <w:rPr>
+          <w:color w:val="000000" w:themeColor="text1"/>
+        </w:rPr>
+      </w:pPr>
+      <w:r>
+        <w:rPr>
+          <w:color w:val="000000" w:themeColor="text1"/>
+        </w:rPr>
+        <w:t xml:space="preserve">Syntax = </w:t>
+      </w:r>
+      <w:r>
+        <w:rPr>
+          <w:color w:val="000000" w:themeColor="text1"/>
+        </w:rPr>
+        <w:t>"$variableName"</w:t>
+      </w:r>
+    </w:p>
+    <w:p>
+      <w:pPr>
+        <w:rPr>
+          <w:color w:val="000000" w:themeColor="text1"/>
+        </w:rPr>
+      </w:pPr>
+      <w:r>
+        <w:rPr>
+          <w:color w:val="000000" w:themeColor="text1"/>
+        </w:rPr>
+        <w:t xml:space="preserve">Ex.  </w:t>
+      </w:r>
+      <w:r>
+        <w:rPr>
+          <w:color w:val="000000" w:themeColor="text1"/>
+        </w:rPr>
+        <w:t>print("Hello $name");</w:t>
+      </w:r>
+    </w:p>
+    <w:p>
+      <w:pPr>
+        <w:rPr>
+          <w:color w:val="000000" w:themeColor="text1"/>
+        </w:rPr>
+      </w:pPr>
+    </w:p>
+    <w:p>
+      <w:pPr>
+        <w:rPr>
+          <w:b/>
+          <w:bCs/>
+          <w:color w:val="000000" w:themeColor="text1"/>
+        </w:rPr>
+      </w:pPr>
+      <w:r>
+        <w:rPr>
+          <w:b/>
+          <w:bCs/>
+          <w:color w:val="000000" w:themeColor="text1"/>
+        </w:rPr>
+        <w:t xml:space="preserve">Topic 5: </w:t>
+      </w:r>
+      <w:r>
+        <w:rPr>
+          <w:b/>
+          <w:bCs/>
+          <w:color w:val="EE0000"/>
+        </w:rPr>
+        <w:t>Functions</w:t>
+      </w:r>
+      <w:r>
+        <w:rPr>
+          <w:b/>
+          <w:bCs/>
+          <w:color w:val="EE0000"/>
+        </w:rPr>
+        <w:t xml:space="preserve"> = </w:t>
+      </w:r>
+      <w:r>
+        <w:rPr>
+          <w:b/>
+          <w:bCs/>
+          <w:color w:val="000000" w:themeColor="text1"/>
+        </w:rPr>
+        <w:t>Function ek reusable block of code hota h</w:t>
+      </w:r>
+      <w:r>
+        <w:rPr>
+          <w:b/>
+          <w:bCs/>
+          <w:color w:val="EE0000"/>
         </w:rPr>
         <w:t xml:space="preserve"> </w:t>
       </w:r>
-      <w:proofErr w:type="spellStart"/>
-      <w:r>
-        <w:rPr>
-          <w:color w:val="000000" w:themeColor="text1"/>
-        </w:rPr>
-        <w:t>andar</w:t>
-      </w:r>
-      <w:proofErr w:type="spellEnd"/>
-      <w:r>
-        <w:rPr>
-          <w:color w:val="000000" w:themeColor="text1"/>
-        </w:rPr>
-        <w:t xml:space="preserve"> use </w:t>
-      </w:r>
-      <w:proofErr w:type="spellStart"/>
-      <w:r>
-        <w:rPr>
-          <w:color w:val="000000" w:themeColor="text1"/>
-        </w:rPr>
-        <w:t>karna</w:t>
-      </w:r>
-      <w:proofErr w:type="spellEnd"/>
-      <w:r>
-        <w:rPr>
-          <w:color w:val="000000" w:themeColor="text1"/>
-        </w:rPr>
-        <w:t>.</w:t>
-      </w:r>
-    </w:p>
-    <w:p>
-      <w:pPr>
-        <w:rPr>
-          <w:color w:val="000000" w:themeColor="text1"/>
-        </w:rPr>
-      </w:pPr>
-      <w:r>
-        <w:rPr>
+      <w:r>
+        <w:rPr>
+          <w:b/>
+          <w:bCs/>
+          <w:color w:val="000000" w:themeColor="text1"/>
+        </w:rPr>
+        <w:t xml:space="preserve">, </w:t>
+      </w:r>
+      <w:r>
+        <w:rPr>
+          <w:b/>
+          <w:bCs/>
+          <w:color w:val="000000" w:themeColor="text1"/>
+        </w:rPr>
+        <w:t>k kaam ko packet me band kar dena</w:t>
+      </w:r>
+      <w:r>
+        <w:rPr>
+          <w:b/>
+          <w:bCs/>
+          <w:color w:val="000000" w:themeColor="text1"/>
+        </w:rPr>
+        <w:t xml:space="preserve">, </w:t>
+      </w:r>
+      <w:r>
+        <w:rPr>
+          <w:b/>
+          <w:bCs/>
+          <w:color w:val="000000" w:themeColor="text1"/>
+        </w:rPr>
+        <w:t>Jab zarurat ho:function ko call karo.</w:t>
+      </w:r>
+    </w:p>
+    <w:p>
+      <w:pPr>
+        <w:rPr>
+          <w:b/>
+          <w:bCs/>
+          <w:color w:val="000000" w:themeColor="text1"/>
+        </w:rPr>
+      </w:pPr>
+      <w:r>
+        <w:rPr>
+          <w:b/>
+          <w:bCs/>
+          <w:color w:val="000000" w:themeColor="text1"/>
+        </w:rPr>
+        <w:t>Function Kyu Use Karte H?</w:t>
+      </w:r>
+    </w:p>
+    <w:p>
+      <w:pPr>
+        <w:rPr>
+          <w:b/>
+          <w:bCs/>
+          <w:color w:val="000000" w:themeColor="text1"/>
+        </w:rPr>
+      </w:pPr>
+      <w:r>
+        <w:rPr>
+          <w:b/>
+          <w:bCs/>
+          <w:color w:val="000000" w:themeColor="text1"/>
+        </w:rPr>
+        <w:t>Without function:</w:t>
+      </w:r>
+      <w:r>
+        <w:rPr>
+          <w:b/>
+          <w:bCs/>
+          <w:color w:val="000000" w:themeColor="text1"/>
+        </w:rPr>
+        <w:t xml:space="preserve"> </w:t>
+      </w:r>
+      <w:r>
+        <w:rPr>
+          <w:b/>
+          <w:bCs/>
+          <w:color w:val="000000" w:themeColor="text1"/>
+        </w:rPr>
+        <w:t>same code baar-baar likhna padega.</w:t>
+      </w:r>
+    </w:p>
+    <w:p>
+      <w:pPr>
+        <w:rPr>
+          <w:b/>
+          <w:bCs/>
+          <w:color w:val="000000" w:themeColor="text1"/>
+        </w:rPr>
+      </w:pPr>
+    </w:p>
+    <w:p>
+      <w:pPr>
+        <w:rPr>
+          <w:b/>
+          <w:bCs/>
+          <w:color w:val="000000" w:themeColor="text1"/>
+        </w:rPr>
+      </w:pPr>
+      <w:r>
+        <w:rPr>
+          <w:b/>
+          <w:bCs/>
           <w:color w:val="000000" w:themeColor="text1"/>
         </w:rPr>
         <w:t xml:space="preserve">Syntax = </w:t>
       </w:r>
       <w:r>
         <w:rPr>
-          <w:color w:val="000000" w:themeColor="text1"/>
-        </w:rPr>
-        <w:t>"$</w:t>
-      </w:r>
-      <w:proofErr w:type="spellStart"/>
-      <w:r>
-        <w:rPr>
-          <w:color w:val="000000" w:themeColor="text1"/>
-        </w:rPr>
-        <w:t>variableName</w:t>
-      </w:r>
-      <w:proofErr w:type="spellEnd"/>
-      <w:r>
-        <w:rPr>
-          <w:color w:val="000000" w:themeColor="text1"/>
-        </w:rPr>
-        <w:t>"</w:t>
-      </w:r>
-    </w:p>
-    <w:p>
-      <w:pPr>
-        <w:rPr>
-          <w:color w:val="000000" w:themeColor="text1"/>
-        </w:rPr>
-      </w:pPr>
-      <w:r>
-        <w:rPr>
-          <w:color w:val="000000" w:themeColor="text1"/>
-        </w:rPr>
-        <w:t xml:space="preserve">Ex.  </w:t>
-      </w:r>
-      <w:proofErr w:type="gramStart"/>
-      <w:r>
-        <w:rPr>
-          <w:color w:val="000000" w:themeColor="text1"/>
-        </w:rPr>
-        <w:t>print(</w:t>
-      </w:r>
-      <w:proofErr w:type="gramEnd"/>
-      <w:r>
-        <w:rPr>
-          <w:color w:val="000000" w:themeColor="text1"/>
-        </w:rPr>
-        <w:t>"Hello $name");</w:t>
-      </w:r>
-    </w:p>
-    <w:p>
-      <w:pPr>
-        <w:rPr>
-          <w:color w:val="000000" w:themeColor="text1"/>
-        </w:rPr>
-      </w:pPr>
-    </w:p>
-    <w:p>
-      <w:pPr>
-        <w:rPr>
-          <w:b/>
-          <w:bCs/>
-          <w:color w:val="000000" w:themeColor="text1"/>
-        </w:rPr>
-      </w:pPr>
-      <w:r>
-        <w:rPr>
-          <w:b/>
-          <w:bCs/>
-          <w:color w:val="000000" w:themeColor="text1"/>
-        </w:rPr>
-        <w:t xml:space="preserve">Topic 5: </w:t>
-      </w:r>
-      <w:r>
-        <w:rPr>
-          <w:b/>
-          <w:bCs/>
-          <w:color w:val="EE0000"/>
-        </w:rPr>
-        <w:t>Functions</w:t>
-      </w:r>
-      <w:r>
-        <w:rPr>
-          <w:b/>
-          <w:bCs/>
-          <w:color w:val="EE0000"/>
-        </w:rPr>
-        <w:t xml:space="preserve"> = </w:t>
-      </w:r>
-      <w:r>
-        <w:rPr>
-          <w:b/>
-          <w:bCs/>
-          <w:color w:val="000000" w:themeColor="text1"/>
-        </w:rPr>
-        <w:t xml:space="preserve">Function ek reusable block of code </w:t>
-      </w:r>
-      <w:proofErr w:type="spellStart"/>
-      <w:r>
-        <w:rPr>
-          <w:b/>
-          <w:bCs/>
-          <w:color w:val="000000" w:themeColor="text1"/>
-        </w:rPr>
-        <w:t>hota</w:t>
-      </w:r>
-      <w:proofErr w:type="spellEnd"/>
+          <w:b/>
+          <w:bCs/>
+          <w:color w:val="000000" w:themeColor="text1"/>
+        </w:rPr>
+        <w:t>void login()</w:t>
+      </w:r>
+    </w:p>
+    <w:p>
+      <w:pPr>
+        <w:rPr>
+          <w:b/>
+          <w:bCs/>
+          <w:color w:val="000000" w:themeColor="text1"/>
+        </w:rPr>
+      </w:pPr>
+      <w:r>
+        <w:rPr>
+          <w:b/>
+          <w:bCs/>
+          <w:color w:val="000000" w:themeColor="text1"/>
+        </w:rPr>
+        <w:t>{</w:t>
+      </w:r>
+    </w:p>
+    <w:p>
+      <w:pPr>
+        <w:rPr>
+          <w:b/>
+          <w:bCs/>
+          <w:color w:val="000000" w:themeColor="text1"/>
+        </w:rPr>
+      </w:pPr>
+      <w:r>
+        <w:rPr>
+          <w:b/>
+          <w:bCs/>
+          <w:color w:val="000000" w:themeColor="text1"/>
+        </w:rPr>
+        <w:t xml:space="preserve">   print("Login</w:t>
+      </w:r>
+      <w:r>
+        <w:rPr>
+          <w:b/>
+          <w:bCs/>
+          <w:color w:val="000000" w:themeColor="text1"/>
+        </w:rPr>
+        <w:t xml:space="preserve"> Success</w:t>
+      </w:r>
+      <w:r>
+        <w:rPr>
+          <w:b/>
+          <w:bCs/>
+          <w:color w:val="000000" w:themeColor="text1"/>
+        </w:rPr>
+        <w:t>");</w:t>
+      </w:r>
+    </w:p>
+    <w:p>
+      <w:pPr>
+        <w:rPr>
+          <w:b/>
+          <w:bCs/>
+          <w:color w:val="000000" w:themeColor="text1"/>
+        </w:rPr>
+      </w:pPr>
+      <w:r>
+        <w:rPr>
+          <w:b/>
+          <w:bCs/>
+          <w:color w:val="000000" w:themeColor="text1"/>
+        </w:rPr>
+        <w:t>}</w:t>
+      </w:r>
+    </w:p>
+    <w:p>
+      <w:pPr>
+        <w:rPr>
+          <w:b/>
+          <w:bCs/>
+          <w:color w:val="000000" w:themeColor="text1"/>
+        </w:rPr>
+      </w:pPr>
+      <w:r>
+        <w:rPr>
+          <w:b/>
+          <w:bCs/>
+          <w:color w:val="000000" w:themeColor="text1"/>
+        </w:rPr>
+        <w:t>Function Call</w:t>
+      </w:r>
+      <w:r>
+        <w:rPr>
+          <w:b/>
+          <w:bCs/>
+          <w:color w:val="000000" w:themeColor="text1"/>
+        </w:rPr>
+        <w:t xml:space="preserve"> kiya </w:t>
+      </w:r>
+      <w:r>
+        <w:rPr>
+          <w:b/>
+          <w:bCs/>
+          <w:color w:val="000000" w:themeColor="text1"/>
+        </w:rPr>
+        <w:t>:</w:t>
+      </w:r>
       <w:r>
         <w:rPr>
           <w:b/>
@@ -735,371 +715,107 @@
         </w:rPr>
         <w:t xml:space="preserve"> </w:t>
       </w:r>
-      <w:proofErr w:type="gramStart"/>
-      <w:r>
-        <w:rPr>
-          <w:b/>
-          <w:bCs/>
-          <w:color w:val="000000" w:themeColor="text1"/>
-        </w:rPr>
-        <w:t>h</w:t>
-      </w:r>
-      <w:r>
-        <w:rPr>
-          <w:b/>
-          <w:bCs/>
-          <w:color w:val="EE0000"/>
-        </w:rPr>
-        <w:t xml:space="preserve"> </w:t>
-      </w:r>
-      <w:r>
-        <w:rPr>
-          <w:b/>
-          <w:bCs/>
-          <w:color w:val="000000" w:themeColor="text1"/>
-        </w:rPr>
-        <w:t>,</w:t>
-      </w:r>
-      <w:proofErr w:type="gramEnd"/>
-      <w:r>
-        <w:rPr>
-          <w:b/>
-          <w:bCs/>
-          <w:color w:val="000000" w:themeColor="text1"/>
-        </w:rPr>
-        <w:t xml:space="preserve"> </w:t>
-      </w:r>
-      <w:r>
-        <w:rPr>
-          <w:b/>
-          <w:bCs/>
-          <w:color w:val="000000" w:themeColor="text1"/>
-        </w:rPr>
-        <w:t xml:space="preserve">k </w:t>
-      </w:r>
-      <w:proofErr w:type="spellStart"/>
-      <w:r>
-        <w:rPr>
-          <w:b/>
-          <w:bCs/>
-          <w:color w:val="000000" w:themeColor="text1"/>
-        </w:rPr>
-        <w:t>kaam</w:t>
-      </w:r>
-      <w:proofErr w:type="spellEnd"/>
-      <w:r>
-        <w:rPr>
-          <w:b/>
-          <w:bCs/>
-          <w:color w:val="000000" w:themeColor="text1"/>
-        </w:rPr>
-        <w:t xml:space="preserve"> ko packet me band </w:t>
-      </w:r>
-      <w:proofErr w:type="spellStart"/>
-      <w:r>
-        <w:rPr>
-          <w:b/>
-          <w:bCs/>
-          <w:color w:val="000000" w:themeColor="text1"/>
-        </w:rPr>
-        <w:t>kar</w:t>
-      </w:r>
-      <w:proofErr w:type="spellEnd"/>
-      <w:r>
-        <w:rPr>
-          <w:b/>
-          <w:bCs/>
-          <w:color w:val="000000" w:themeColor="text1"/>
-        </w:rPr>
-        <w:t xml:space="preserve"> </w:t>
-      </w:r>
-      <w:proofErr w:type="spellStart"/>
-      <w:r>
-        <w:rPr>
-          <w:b/>
-          <w:bCs/>
-          <w:color w:val="000000" w:themeColor="text1"/>
-        </w:rPr>
-        <w:t>dena</w:t>
-      </w:r>
-      <w:proofErr w:type="spellEnd"/>
-      <w:r>
-        <w:rPr>
-          <w:b/>
-          <w:bCs/>
-          <w:color w:val="000000" w:themeColor="text1"/>
-        </w:rPr>
-        <w:t xml:space="preserve">, </w:t>
-      </w:r>
-      <w:r>
-        <w:rPr>
-          <w:b/>
-          <w:bCs/>
-          <w:color w:val="000000" w:themeColor="text1"/>
-        </w:rPr>
-        <w:t xml:space="preserve">Jab </w:t>
-      </w:r>
-      <w:proofErr w:type="spellStart"/>
-      <w:r>
-        <w:rPr>
-          <w:b/>
-          <w:bCs/>
-          <w:color w:val="000000" w:themeColor="text1"/>
-        </w:rPr>
-        <w:t>zarurat</w:t>
-      </w:r>
-      <w:proofErr w:type="spellEnd"/>
-      <w:r>
-        <w:rPr>
-          <w:b/>
-          <w:bCs/>
-          <w:color w:val="000000" w:themeColor="text1"/>
-        </w:rPr>
-        <w:t xml:space="preserve"> </w:t>
-      </w:r>
-      <w:proofErr w:type="spellStart"/>
-      <w:proofErr w:type="gramStart"/>
-      <w:r>
-        <w:rPr>
-          <w:b/>
-          <w:bCs/>
-          <w:color w:val="000000" w:themeColor="text1"/>
-        </w:rPr>
-        <w:t>ho:function</w:t>
-      </w:r>
-      <w:proofErr w:type="spellEnd"/>
-      <w:proofErr w:type="gramEnd"/>
-      <w:r>
-        <w:rPr>
-          <w:b/>
-          <w:bCs/>
-          <w:color w:val="000000" w:themeColor="text1"/>
-        </w:rPr>
-        <w:t xml:space="preserve"> ko call karo.</w:t>
-      </w:r>
-    </w:p>
-    <w:p>
-      <w:pPr>
-        <w:rPr>
-          <w:b/>
-          <w:bCs/>
-          <w:color w:val="000000" w:themeColor="text1"/>
-        </w:rPr>
-      </w:pPr>
-      <w:r>
-        <w:rPr>
-          <w:b/>
-          <w:bCs/>
-          <w:color w:val="000000" w:themeColor="text1"/>
-        </w:rPr>
-        <w:t>Function Kyu Use Karte H?</w:t>
-      </w:r>
-    </w:p>
-    <w:p>
-      <w:pPr>
-        <w:rPr>
-          <w:b/>
-          <w:bCs/>
-          <w:color w:val="000000" w:themeColor="text1"/>
-        </w:rPr>
-      </w:pPr>
-      <w:r>
-        <w:rPr>
-          <w:b/>
-          <w:bCs/>
-          <w:color w:val="000000" w:themeColor="text1"/>
-        </w:rPr>
-        <w:t>Without function:</w:t>
-      </w:r>
-      <w:r>
-        <w:rPr>
-          <w:b/>
-          <w:bCs/>
-          <w:color w:val="000000" w:themeColor="text1"/>
-        </w:rPr>
-        <w:t xml:space="preserve"> </w:t>
-      </w:r>
-      <w:r>
-        <w:rPr>
-          <w:b/>
-          <w:bCs/>
-          <w:color w:val="000000" w:themeColor="text1"/>
-        </w:rPr>
-        <w:t xml:space="preserve">same code </w:t>
-      </w:r>
-      <w:proofErr w:type="spellStart"/>
-      <w:r>
-        <w:rPr>
-          <w:b/>
-          <w:bCs/>
-          <w:color w:val="000000" w:themeColor="text1"/>
-        </w:rPr>
-        <w:t>baar-baar</w:t>
-      </w:r>
-      <w:proofErr w:type="spellEnd"/>
-      <w:r>
-        <w:rPr>
-          <w:b/>
-          <w:bCs/>
-          <w:color w:val="000000" w:themeColor="text1"/>
-        </w:rPr>
-        <w:t xml:space="preserve"> </w:t>
-      </w:r>
-      <w:proofErr w:type="spellStart"/>
-      <w:r>
-        <w:rPr>
-          <w:b/>
-          <w:bCs/>
-          <w:color w:val="000000" w:themeColor="text1"/>
-        </w:rPr>
-        <w:t>likhna</w:t>
-      </w:r>
-      <w:proofErr w:type="spellEnd"/>
-      <w:r>
-        <w:rPr>
-          <w:b/>
-          <w:bCs/>
-          <w:color w:val="000000" w:themeColor="text1"/>
-        </w:rPr>
-        <w:t xml:space="preserve"> </w:t>
-      </w:r>
-      <w:proofErr w:type="spellStart"/>
-      <w:r>
-        <w:rPr>
-          <w:b/>
-          <w:bCs/>
-          <w:color w:val="000000" w:themeColor="text1"/>
-        </w:rPr>
-        <w:t>padega</w:t>
-      </w:r>
-      <w:proofErr w:type="spellEnd"/>
-      <w:r>
-        <w:rPr>
-          <w:b/>
-          <w:bCs/>
-          <w:color w:val="000000" w:themeColor="text1"/>
-        </w:rPr>
-        <w:t>.</w:t>
-      </w:r>
-    </w:p>
-    <w:p>
-      <w:pPr>
-        <w:rPr>
-          <w:b/>
-          <w:bCs/>
-          <w:color w:val="000000" w:themeColor="text1"/>
-        </w:rPr>
-      </w:pPr>
-    </w:p>
-    <w:p>
-      <w:pPr>
-        <w:rPr>
-          <w:b/>
-          <w:bCs/>
-          <w:color w:val="000000" w:themeColor="text1"/>
-        </w:rPr>
-      </w:pPr>
-      <w:r>
-        <w:rPr>
-          <w:b/>
-          <w:bCs/>
-          <w:color w:val="000000" w:themeColor="text1"/>
-        </w:rPr>
-        <w:t xml:space="preserve">Syntax = </w:t>
-      </w:r>
-      <w:r>
-        <w:rPr>
-          <w:b/>
-          <w:bCs/>
-          <w:color w:val="000000" w:themeColor="text1"/>
-        </w:rPr>
-        <w:t xml:space="preserve">void </w:t>
-      </w:r>
-      <w:proofErr w:type="gramStart"/>
-      <w:r>
-        <w:rPr>
-          <w:b/>
-          <w:bCs/>
-          <w:color w:val="000000" w:themeColor="text1"/>
-        </w:rPr>
-        <w:t>login(</w:t>
-      </w:r>
-      <w:proofErr w:type="gramEnd"/>
-      <w:r>
-        <w:rPr>
-          <w:b/>
-          <w:bCs/>
-          <w:color w:val="000000" w:themeColor="text1"/>
-        </w:rPr>
-        <w:t>)</w:t>
-      </w:r>
-    </w:p>
-    <w:p>
-      <w:pPr>
-        <w:rPr>
-          <w:b/>
-          <w:bCs/>
-          <w:color w:val="000000" w:themeColor="text1"/>
-        </w:rPr>
-      </w:pPr>
-      <w:r>
-        <w:rPr>
-          <w:b/>
-          <w:bCs/>
-          <w:color w:val="000000" w:themeColor="text1"/>
-        </w:rPr>
-        <w:t>{</w:t>
-      </w:r>
-    </w:p>
-    <w:p>
-      <w:pPr>
-        <w:rPr>
-          <w:b/>
-          <w:bCs/>
-          <w:color w:val="000000" w:themeColor="text1"/>
-        </w:rPr>
-      </w:pPr>
-      <w:r>
-        <w:rPr>
-          <w:b/>
-          <w:bCs/>
-          <w:color w:val="000000" w:themeColor="text1"/>
-        </w:rPr>
-        <w:t xml:space="preserve">   </w:t>
-      </w:r>
-      <w:proofErr w:type="gramStart"/>
-      <w:r>
-        <w:rPr>
-          <w:b/>
-          <w:bCs/>
-          <w:color w:val="000000" w:themeColor="text1"/>
-        </w:rPr>
-        <w:t>print(</w:t>
-      </w:r>
-      <w:proofErr w:type="gramEnd"/>
-      <w:r>
-        <w:rPr>
-          <w:b/>
-          <w:bCs/>
-          <w:color w:val="000000" w:themeColor="text1"/>
-        </w:rPr>
-        <w:t>"Login</w:t>
-      </w:r>
-      <w:r>
-        <w:rPr>
-          <w:b/>
-          <w:bCs/>
-          <w:color w:val="000000" w:themeColor="text1"/>
-        </w:rPr>
-        <w:t xml:space="preserve"> Success</w:t>
-      </w:r>
-      <w:r>
-        <w:rPr>
-          <w:b/>
-          <w:bCs/>
-          <w:color w:val="000000" w:themeColor="text1"/>
-        </w:rPr>
-        <w:t>");</w:t>
+    </w:p>
+    <w:p>
+      <w:pPr>
+        <w:rPr>
+          <w:b/>
+          <w:bCs/>
+          <w:color w:val="000000" w:themeColor="text1"/>
+        </w:rPr>
+      </w:pPr>
+      <w:r>
+        <w:rPr>
+          <w:b/>
+          <w:bCs/>
+          <w:color w:val="000000" w:themeColor="text1"/>
+        </w:rPr>
+        <w:t>login();</w:t>
+      </w:r>
+    </w:p>
+    <w:p>
+      <w:pPr>
+        <w:rPr>
+          <w:b/>
+          <w:bCs/>
+          <w:color w:val="000000" w:themeColor="text1"/>
+        </w:rPr>
+      </w:pPr>
+      <w:r>
+        <w:rPr>
+          <w:b/>
+          <w:bCs/>
+          <w:color w:val="000000" w:themeColor="text1"/>
+        </w:rPr>
+        <w:t xml:space="preserve"> output ayaga   [           Login   Success    ]</w:t>
+      </w:r>
+    </w:p>
+    <w:p>
+      <w:pPr>
+        <w:rPr>
+          <w:b/>
+          <w:bCs/>
+          <w:color w:val="000000" w:themeColor="text1"/>
+        </w:rPr>
+      </w:pPr>
+    </w:p>
+    <w:p>
+      <w:pPr>
+        <w:rPr>
+          <w:b/>
+          <w:bCs/>
+          <w:color w:val="000000" w:themeColor="text1"/>
+        </w:rPr>
+      </w:pPr>
+      <w:r>
+        <w:rPr>
+          <w:b/>
+          <w:bCs/>
+          <w:color w:val="000000" w:themeColor="text1"/>
+        </w:rPr>
+        <w:t xml:space="preserve">eg : </w:t>
+      </w:r>
+      <w:r>
+        <w:rPr>
+          <w:b/>
+          <w:bCs/>
+          <w:color w:val="000000" w:themeColor="text1"/>
+        </w:rPr>
+        <w:t>String name = "Abhi";</w:t>
+      </w:r>
+    </w:p>
+    <w:p>
+      <w:pPr>
+        <w:rPr>
+          <w:b/>
+          <w:bCs/>
+          <w:color w:val="000000" w:themeColor="text1"/>
+        </w:rPr>
+      </w:pPr>
+      <w:r>
+        <w:rPr>
+          <w:b/>
+          <w:bCs/>
+          <w:color w:val="000000" w:themeColor="text1"/>
+        </w:rPr>
+        <w:t>void greet(String name)</w:t>
+      </w:r>
+    </w:p>
+    <w:p>
+      <w:pPr>
+        <w:rPr>
+          <w:b/>
+          <w:bCs/>
+          <w:color w:val="000000" w:themeColor="text1"/>
+        </w:rPr>
+      </w:pPr>
+      <w:r>
+        <w:rPr>
+          <w:b/>
+          <w:bCs/>
+          <w:color w:val="000000" w:themeColor="text1"/>
+        </w:rPr>
+        <w:t>{   print(name);</w:t>
       </w:r>
     </w:p>
     <w:p>
@@ -1133,282 +849,6 @@
           <w:bCs/>
           <w:color w:val="000000" w:themeColor="text1"/>
         </w:rPr>
-        <w:t>Function Call</w:t>
-      </w:r>
-      <w:r>
-        <w:rPr>
-          <w:b/>
-          <w:bCs/>
-          <w:color w:val="000000" w:themeColor="text1"/>
-        </w:rPr>
-        <w:t xml:space="preserve"> </w:t>
-      </w:r>
-      <w:proofErr w:type="spellStart"/>
-      <w:proofErr w:type="gramStart"/>
-      <w:r>
-        <w:rPr>
-          <w:b/>
-          <w:bCs/>
-          <w:color w:val="000000" w:themeColor="text1"/>
-        </w:rPr>
-        <w:t>kiya</w:t>
-      </w:r>
-      <w:proofErr w:type="spellEnd"/>
-      <w:r>
-        <w:rPr>
-          <w:b/>
-          <w:bCs/>
-          <w:color w:val="000000" w:themeColor="text1"/>
-        </w:rPr>
-        <w:t xml:space="preserve"> </w:t>
-      </w:r>
-      <w:r>
-        <w:rPr>
-          <w:b/>
-          <w:bCs/>
-          <w:color w:val="000000" w:themeColor="text1"/>
-        </w:rPr>
-        <w:t>:</w:t>
-      </w:r>
-      <w:proofErr w:type="gramEnd"/>
-      <w:r>
-        <w:rPr>
-          <w:b/>
-          <w:bCs/>
-          <w:color w:val="000000" w:themeColor="text1"/>
-        </w:rPr>
-        <w:t xml:space="preserve"> </w:t>
-      </w:r>
-    </w:p>
-    <w:p>
-      <w:pPr>
-        <w:rPr>
-          <w:b/>
-          <w:bCs/>
-          <w:color w:val="000000" w:themeColor="text1"/>
-        </w:rPr>
-      </w:pPr>
-      <w:proofErr w:type="gramStart"/>
-      <w:r>
-        <w:rPr>
-          <w:b/>
-          <w:bCs/>
-          <w:color w:val="000000" w:themeColor="text1"/>
-        </w:rPr>
-        <w:t>login(</w:t>
-      </w:r>
-      <w:proofErr w:type="gramEnd"/>
-      <w:r>
-        <w:rPr>
-          <w:b/>
-          <w:bCs/>
-          <w:color w:val="000000" w:themeColor="text1"/>
-        </w:rPr>
-        <w:t>);</w:t>
-      </w:r>
-    </w:p>
-    <w:p>
-      <w:pPr>
-        <w:rPr>
-          <w:b/>
-          <w:bCs/>
-          <w:color w:val="000000" w:themeColor="text1"/>
-        </w:rPr>
-      </w:pPr>
-      <w:r>
-        <w:rPr>
-          <w:b/>
-          <w:bCs/>
-          <w:color w:val="000000" w:themeColor="text1"/>
-        </w:rPr>
-        <w:t xml:space="preserve"> output </w:t>
-      </w:r>
-      <w:proofErr w:type="spellStart"/>
-      <w:r>
-        <w:rPr>
-          <w:b/>
-          <w:bCs/>
-          <w:color w:val="000000" w:themeColor="text1"/>
-        </w:rPr>
-        <w:t>ayaga</w:t>
-      </w:r>
-      <w:proofErr w:type="spellEnd"/>
-      <w:proofErr w:type="gramStart"/>
-      <w:r>
-        <w:rPr>
-          <w:b/>
-          <w:bCs/>
-          <w:color w:val="000000" w:themeColor="text1"/>
-        </w:rPr>
-        <w:t xml:space="preserve">   [</w:t>
-      </w:r>
-      <w:proofErr w:type="gramEnd"/>
-      <w:r>
-        <w:rPr>
-          <w:b/>
-          <w:bCs/>
-          <w:color w:val="000000" w:themeColor="text1"/>
-        </w:rPr>
-        <w:t xml:space="preserve">           Login   Success  </w:t>
-      </w:r>
-      <w:proofErr w:type="gramStart"/>
-      <w:r>
-        <w:rPr>
-          <w:b/>
-          <w:bCs/>
-          <w:color w:val="000000" w:themeColor="text1"/>
-        </w:rPr>
-        <w:t xml:space="preserve">  ]</w:t>
-      </w:r>
-      <w:proofErr w:type="gramEnd"/>
-    </w:p>
-    <w:p>
-      <w:pPr>
-        <w:rPr>
-          <w:b/>
-          <w:bCs/>
-          <w:color w:val="000000" w:themeColor="text1"/>
-        </w:rPr>
-      </w:pPr>
-    </w:p>
-    <w:p>
-      <w:pPr>
-        <w:rPr>
-          <w:b/>
-          <w:bCs/>
-          <w:color w:val="000000" w:themeColor="text1"/>
-        </w:rPr>
-      </w:pPr>
-      <w:proofErr w:type="spellStart"/>
-      <w:proofErr w:type="gramStart"/>
-      <w:r>
-        <w:rPr>
-          <w:b/>
-          <w:bCs/>
-          <w:color w:val="000000" w:themeColor="text1"/>
-        </w:rPr>
-        <w:t>eg</w:t>
-      </w:r>
-      <w:proofErr w:type="spellEnd"/>
-      <w:r>
-        <w:rPr>
-          <w:b/>
-          <w:bCs/>
-          <w:color w:val="000000" w:themeColor="text1"/>
-        </w:rPr>
-        <w:t xml:space="preserve"> :</w:t>
-      </w:r>
-      <w:proofErr w:type="gramEnd"/>
-      <w:r>
-        <w:rPr>
-          <w:b/>
-          <w:bCs/>
-          <w:color w:val="000000" w:themeColor="text1"/>
-        </w:rPr>
-        <w:t xml:space="preserve"> </w:t>
-      </w:r>
-      <w:r>
-        <w:rPr>
-          <w:b/>
-          <w:bCs/>
-          <w:color w:val="000000" w:themeColor="text1"/>
-        </w:rPr>
-        <w:t>String name = "Abhi";</w:t>
-      </w:r>
-    </w:p>
-    <w:p>
-      <w:pPr>
-        <w:rPr>
-          <w:b/>
-          <w:bCs/>
-          <w:color w:val="000000" w:themeColor="text1"/>
-        </w:rPr>
-      </w:pPr>
-      <w:r>
-        <w:rPr>
-          <w:b/>
-          <w:bCs/>
-          <w:color w:val="000000" w:themeColor="text1"/>
-        </w:rPr>
-        <w:t xml:space="preserve">void </w:t>
-      </w:r>
-      <w:proofErr w:type="gramStart"/>
-      <w:r>
-        <w:rPr>
-          <w:b/>
-          <w:bCs/>
-          <w:color w:val="000000" w:themeColor="text1"/>
-        </w:rPr>
-        <w:t>greet(</w:t>
-      </w:r>
-      <w:proofErr w:type="gramEnd"/>
-      <w:r>
-        <w:rPr>
-          <w:b/>
-          <w:bCs/>
-          <w:color w:val="000000" w:themeColor="text1"/>
-        </w:rPr>
-        <w:t>String name)</w:t>
-      </w:r>
-    </w:p>
-    <w:p>
-      <w:pPr>
-        <w:rPr>
-          <w:b/>
-          <w:bCs/>
-          <w:color w:val="000000" w:themeColor="text1"/>
-        </w:rPr>
-      </w:pPr>
-      <w:proofErr w:type="gramStart"/>
-      <w:r>
-        <w:rPr>
-          <w:b/>
-          <w:bCs/>
-          <w:color w:val="000000" w:themeColor="text1"/>
-        </w:rPr>
-        <w:t xml:space="preserve">{  </w:t>
-      </w:r>
-      <w:proofErr w:type="gramEnd"/>
-      <w:r>
-        <w:rPr>
-          <w:b/>
-          <w:bCs/>
-          <w:color w:val="000000" w:themeColor="text1"/>
-        </w:rPr>
-        <w:t xml:space="preserve"> print(name);</w:t>
-      </w:r>
-    </w:p>
-    <w:p>
-      <w:pPr>
-        <w:rPr>
-          <w:b/>
-          <w:bCs/>
-          <w:color w:val="000000" w:themeColor="text1"/>
-        </w:rPr>
-      </w:pPr>
-      <w:r>
-        <w:rPr>
-          <w:b/>
-          <w:bCs/>
-          <w:color w:val="000000" w:themeColor="text1"/>
-        </w:rPr>
-        <w:t>}</w:t>
-      </w:r>
-    </w:p>
-    <w:p>
-      <w:pPr>
-        <w:rPr>
-          <w:b/>
-          <w:bCs/>
-          <w:color w:val="000000" w:themeColor="text1"/>
-        </w:rPr>
-      </w:pPr>
-      <w:r>
-        <w:rPr>
-          <w:b/>
-          <w:bCs/>
-          <w:color w:val="000000" w:themeColor="text1"/>
-        </w:rPr>
         <w:t>greet(name);</w:t>
       </w:r>
     </w:p>
@@ -1420,23 +860,13 @@
           <w:color w:val="000000" w:themeColor="text1"/>
         </w:rPr>
       </w:pPr>
-      <w:proofErr w:type="gramStart"/>
-      <w:r>
-        <w:rPr>
-          <w:b/>
-          <w:bCs/>
-          <w:color w:val="000000" w:themeColor="text1"/>
-        </w:rPr>
-        <w:t>Output :</w:t>
-      </w:r>
-      <w:proofErr w:type="gramEnd"/>
-      <w:r>
-        <w:rPr>
-          <w:b/>
-          <w:bCs/>
-          <w:color w:val="000000" w:themeColor="text1"/>
-        </w:rPr>
-        <w:t xml:space="preserve"> Abhi </w:t>
+      <w:r>
+        <w:rPr>
+          <w:b/>
+          <w:bCs/>
+          <w:color w:val="000000" w:themeColor="text1"/>
+        </w:rPr>
+        <w:t xml:space="preserve">Output : Abhi </w:t>
       </w:r>
     </w:p>
     <w:p>
@@ -1504,25 +934,7 @@
           <w:bCs/>
           <w:color w:val="000000" w:themeColor="text1"/>
         </w:rPr>
-        <w:t xml:space="preserve">List multiple values store </w:t>
-      </w:r>
-      <w:proofErr w:type="spellStart"/>
-      <w:r>
-        <w:rPr>
-          <w:b/>
-          <w:bCs/>
-          <w:color w:val="000000" w:themeColor="text1"/>
-        </w:rPr>
-        <w:t>karti</w:t>
-      </w:r>
-      <w:proofErr w:type="spellEnd"/>
-      <w:r>
-        <w:rPr>
-          <w:b/>
-          <w:bCs/>
-          <w:color w:val="000000" w:themeColor="text1"/>
-        </w:rPr>
-        <w:t xml:space="preserve"> h</w:t>
+        <w:t>List multiple values store karti h</w:t>
       </w:r>
       <w:r>
         <w:rPr>
@@ -1538,35 +950,247 @@
           <w:bCs/>
           <w:color w:val="000000" w:themeColor="text1"/>
         </w:rPr>
-        <w:t xml:space="preserve">k variable me bahut sara data store </w:t>
-      </w:r>
-      <w:proofErr w:type="spellStart"/>
-      <w:r>
-        <w:rPr>
-          <w:b/>
-          <w:bCs/>
-          <w:color w:val="000000" w:themeColor="text1"/>
-        </w:rPr>
-        <w:t>karna</w:t>
-      </w:r>
-      <w:proofErr w:type="spellEnd"/>
-      <w:r>
-        <w:rPr>
-          <w:b/>
-          <w:bCs/>
-          <w:color w:val="000000" w:themeColor="text1"/>
-        </w:rPr>
-        <w:t>.</w:t>
-      </w:r>
-      <w:r>
-        <w:rPr>
-          <w:b/>
-          <w:bCs/>
-          <w:color w:val="000000" w:themeColor="text1"/>
-        </w:rPr>
-        <w:t xml:space="preserve"> Eg</w:t>
-      </w:r>
-      <w:proofErr w:type="gramStart"/>
+        <w:t>k variable me bahut sara data store karna.</w:t>
+      </w:r>
+      <w:r>
+        <w:rPr>
+          <w:b/>
+          <w:bCs/>
+          <w:color w:val="000000" w:themeColor="text1"/>
+        </w:rPr>
+        <w:t xml:space="preserve"> Eg:  </w:t>
+      </w:r>
+      <w:r>
+        <w:rPr>
+          <w:b/>
+          <w:bCs/>
+          <w:color w:val="000000" w:themeColor="text1"/>
+        </w:rPr>
+        <w:t>List names = ["Abhi", "Rahul", "Kartik"];</w:t>
+      </w:r>
+    </w:p>
+    <w:p>
+      <w:pPr>
+        <w:rPr>
+          <w:b/>
+          <w:bCs/>
+          <w:color w:val="000000" w:themeColor="text1"/>
+        </w:rPr>
+      </w:pPr>
+      <w:r>
+        <w:rPr>
+          <w:b/>
+          <w:bCs/>
+          <w:color w:val="000000" w:themeColor="text1"/>
+        </w:rPr>
+        <w:t>List me har item ka number hota h</w:t>
+      </w:r>
+      <w:r>
+        <w:rPr>
+          <w:b/>
+          <w:bCs/>
+          <w:color w:val="000000" w:themeColor="text1"/>
+        </w:rPr>
+        <w:t xml:space="preserve">, </w:t>
+      </w:r>
+      <w:r>
+        <w:rPr>
+          <w:b/>
+          <w:bCs/>
+          <w:color w:val="000000" w:themeColor="text1"/>
+        </w:rPr>
+        <w:t>Usko:index</w:t>
+      </w:r>
+      <w:r>
+        <w:rPr>
+          <w:b/>
+          <w:bCs/>
+          <w:color w:val="000000" w:themeColor="text1"/>
+        </w:rPr>
+        <w:t xml:space="preserve">/ ya indexing </w:t>
+      </w:r>
+      <w:r>
+        <w:rPr>
+          <w:b/>
+          <w:bCs/>
+          <w:color w:val="000000" w:themeColor="text1"/>
+        </w:rPr>
+        <w:t>bolte h.</w:t>
+      </w:r>
+      <w:r>
+        <w:rPr>
+          <w:b/>
+          <w:bCs/>
+          <w:color w:val="000000" w:themeColor="text1"/>
+        </w:rPr>
+        <w:t xml:space="preserve"> ye 0 ye strat hoti h (n-1) tak chalti h </w:t>
+      </w:r>
+    </w:p>
+    <w:p>
+      <w:pPr>
+        <w:rPr>
+          <w:b/>
+          <w:bCs/>
+          <w:color w:val="000000" w:themeColor="text1"/>
+        </w:rPr>
+      </w:pPr>
+      <w:r>
+        <w:rPr>
+          <w:b/>
+          <w:bCs/>
+          <w:color w:val="000000" w:themeColor="text1"/>
+        </w:rPr>
+        <w:t>names.add("</w:t>
+      </w:r>
+      <w:r>
+        <w:rPr>
+          <w:b/>
+          <w:bCs/>
+          <w:color w:val="000000" w:themeColor="text1"/>
+        </w:rPr>
+        <w:t>Kalu</w:t>
+      </w:r>
+      <w:r>
+        <w:rPr>
+          <w:b/>
+          <w:bCs/>
+          <w:color w:val="000000" w:themeColor="text1"/>
+        </w:rPr>
+        <w:t>");</w:t>
+      </w:r>
+    </w:p>
+    <w:p>
+      <w:pPr>
+        <w:rPr>
+          <w:b/>
+          <w:bCs/>
+          <w:color w:val="000000" w:themeColor="text1"/>
+        </w:rPr>
+      </w:pPr>
+      <w:r>
+        <w:rPr>
+          <w:b/>
+          <w:bCs/>
+          <w:color w:val="000000" w:themeColor="text1"/>
+        </w:rPr>
+        <w:t xml:space="preserve">Output : </w:t>
+      </w:r>
+      <w:r>
+        <w:rPr>
+          <w:b/>
+          <w:bCs/>
+          <w:color w:val="000000" w:themeColor="text1"/>
+        </w:rPr>
+        <w:t xml:space="preserve">[Abhi, Rahul, </w:t>
+      </w:r>
+      <w:r>
+        <w:rPr>
+          <w:b/>
+          <w:bCs/>
+          <w:color w:val="000000" w:themeColor="text1"/>
+        </w:rPr>
+        <w:t>Kartik , Kalu</w:t>
+      </w:r>
+      <w:r>
+        <w:rPr>
+          <w:b/>
+          <w:bCs/>
+          <w:color w:val="000000" w:themeColor="text1"/>
+        </w:rPr>
+        <w:t>]</w:t>
+      </w:r>
+    </w:p>
+    <w:p>
+      <w:pPr>
+        <w:rPr>
+          <w:b/>
+          <w:bCs/>
+          <w:color w:val="000000" w:themeColor="text1"/>
+        </w:rPr>
+      </w:pPr>
+      <w:r>
+        <w:rPr>
+          <w:b/>
+          <w:bCs/>
+          <w:color w:val="000000" w:themeColor="text1"/>
+        </w:rPr>
+        <w:t>Remove.name(“Kalu”);4</w:t>
+      </w:r>
+    </w:p>
+    <w:p>
+      <w:pPr>
+        <w:rPr>
+          <w:b/>
+          <w:bCs/>
+          <w:color w:val="000000" w:themeColor="text1"/>
+        </w:rPr>
+      </w:pPr>
+      <w:r>
+        <w:rPr>
+          <w:b/>
+          <w:bCs/>
+          <w:color w:val="000000" w:themeColor="text1"/>
+        </w:rPr>
+        <w:t xml:space="preserve">Output: </w:t>
+      </w:r>
+      <w:r>
+        <w:rPr>
+          <w:b/>
+          <w:bCs/>
+          <w:color w:val="000000" w:themeColor="text1"/>
+        </w:rPr>
+        <w:t xml:space="preserve">[Abhi, Rahul, </w:t>
+      </w:r>
+      <w:r>
+        <w:rPr>
+          <w:b/>
+          <w:bCs/>
+          <w:color w:val="000000" w:themeColor="text1"/>
+        </w:rPr>
+        <w:t>Kartik</w:t>
+      </w:r>
+      <w:r>
+        <w:rPr>
+          <w:b/>
+          <w:bCs/>
+          <w:color w:val="000000" w:themeColor="text1"/>
+        </w:rPr>
+        <w:t>]</w:t>
+      </w:r>
+    </w:p>
+    <w:p>
+      <w:pPr>
+        <w:rPr>
+          <w:b/>
+          <w:bCs/>
+          <w:color w:val="000000" w:themeColor="text1"/>
+        </w:rPr>
+      </w:pPr>
+    </w:p>
+    <w:p>
+      <w:pPr>
+        <w:rPr>
+          <w:b/>
+          <w:bCs/>
+          <w:color w:val="000000" w:themeColor="text1"/>
+        </w:rPr>
+      </w:pPr>
+      <w:r>
+        <w:rPr>
+          <w:b/>
+          <w:bCs/>
+          <w:color w:val="000000" w:themeColor="text1"/>
+        </w:rPr>
+        <w:t xml:space="preserve">Topic 7: </w:t>
+      </w:r>
+      <w:r>
+        <w:rPr>
+          <w:b/>
+          <w:bCs/>
+          <w:color w:val="EE0000"/>
+        </w:rPr>
+        <w:t>Map</w:t>
+      </w:r>
       <w:r>
         <w:rPr>
           <w:b/>
@@ -1581,453 +1205,7 @@
           <w:bCs/>
           <w:color w:val="000000" w:themeColor="text1"/>
         </w:rPr>
-        <w:t>List</w:t>
-      </w:r>
-      <w:proofErr w:type="gramEnd"/>
-      <w:r>
-        <w:rPr>
-          <w:b/>
-          <w:bCs/>
-          <w:color w:val="000000" w:themeColor="text1"/>
-        </w:rPr>
-        <w:t xml:space="preserve"> names = ["Abhi", "Rahul", "Kartik"];</w:t>
-      </w:r>
-    </w:p>
-    <w:p>
-      <w:pPr>
-        <w:rPr>
-          <w:b/>
-          <w:bCs/>
-          <w:color w:val="000000" w:themeColor="text1"/>
-        </w:rPr>
-      </w:pPr>
-      <w:r>
-        <w:rPr>
-          <w:b/>
-          <w:bCs/>
-          <w:color w:val="000000" w:themeColor="text1"/>
-        </w:rPr>
-        <w:t xml:space="preserve">List me </w:t>
-      </w:r>
-      <w:proofErr w:type="spellStart"/>
-      <w:r>
-        <w:rPr>
-          <w:b/>
-          <w:bCs/>
-          <w:color w:val="000000" w:themeColor="text1"/>
-        </w:rPr>
-        <w:t>har</w:t>
-      </w:r>
-      <w:proofErr w:type="spellEnd"/>
-      <w:r>
-        <w:rPr>
-          <w:b/>
-          <w:bCs/>
-          <w:color w:val="000000" w:themeColor="text1"/>
-        </w:rPr>
-        <w:t xml:space="preserve"> item ka number </w:t>
-      </w:r>
-      <w:proofErr w:type="spellStart"/>
-      <w:r>
-        <w:rPr>
-          <w:b/>
-          <w:bCs/>
-          <w:color w:val="000000" w:themeColor="text1"/>
-        </w:rPr>
-        <w:t>hota</w:t>
-      </w:r>
-      <w:proofErr w:type="spellEnd"/>
-      <w:r>
-        <w:rPr>
-          <w:b/>
-          <w:bCs/>
-          <w:color w:val="000000" w:themeColor="text1"/>
-        </w:rPr>
-        <w:t xml:space="preserve"> h</w:t>
-      </w:r>
-      <w:r>
-        <w:rPr>
-          <w:b/>
-          <w:bCs/>
-          <w:color w:val="000000" w:themeColor="text1"/>
-        </w:rPr>
-        <w:t xml:space="preserve">, </w:t>
-      </w:r>
-      <w:proofErr w:type="spellStart"/>
-      <w:proofErr w:type="gramStart"/>
-      <w:r>
-        <w:rPr>
-          <w:b/>
-          <w:bCs/>
-          <w:color w:val="000000" w:themeColor="text1"/>
-        </w:rPr>
-        <w:t>Usko:index</w:t>
-      </w:r>
-      <w:proofErr w:type="spellEnd"/>
-      <w:proofErr w:type="gramEnd"/>
-      <w:r>
-        <w:rPr>
-          <w:b/>
-          <w:bCs/>
-          <w:color w:val="000000" w:themeColor="text1"/>
-        </w:rPr>
-        <w:t xml:space="preserve">/ </w:t>
-      </w:r>
-      <w:proofErr w:type="spellStart"/>
-      <w:r>
-        <w:rPr>
-          <w:b/>
-          <w:bCs/>
-          <w:color w:val="000000" w:themeColor="text1"/>
-        </w:rPr>
-        <w:t>ya</w:t>
-      </w:r>
-      <w:proofErr w:type="spellEnd"/>
-      <w:r>
-        <w:rPr>
-          <w:b/>
-          <w:bCs/>
-          <w:color w:val="000000" w:themeColor="text1"/>
-        </w:rPr>
-        <w:t xml:space="preserve"> indexing </w:t>
-      </w:r>
-      <w:proofErr w:type="spellStart"/>
-      <w:r>
-        <w:rPr>
-          <w:b/>
-          <w:bCs/>
-          <w:color w:val="000000" w:themeColor="text1"/>
-        </w:rPr>
-        <w:t>bolte</w:t>
-      </w:r>
-      <w:proofErr w:type="spellEnd"/>
-      <w:r>
-        <w:rPr>
-          <w:b/>
-          <w:bCs/>
-          <w:color w:val="000000" w:themeColor="text1"/>
-        </w:rPr>
-        <w:t xml:space="preserve"> h.</w:t>
-      </w:r>
-      <w:r>
-        <w:rPr>
-          <w:b/>
-          <w:bCs/>
-          <w:color w:val="000000" w:themeColor="text1"/>
-        </w:rPr>
-        <w:t xml:space="preserve"> ye 0 ye </w:t>
-      </w:r>
-      <w:proofErr w:type="spellStart"/>
-      <w:r>
-        <w:rPr>
-          <w:b/>
-          <w:bCs/>
-          <w:color w:val="000000" w:themeColor="text1"/>
-        </w:rPr>
-        <w:t>strat</w:t>
-      </w:r>
-      <w:proofErr w:type="spellEnd"/>
-      <w:r>
-        <w:rPr>
-          <w:b/>
-          <w:bCs/>
-          <w:color w:val="000000" w:themeColor="text1"/>
-        </w:rPr>
-        <w:t xml:space="preserve"> </w:t>
-      </w:r>
-      <w:proofErr w:type="spellStart"/>
-      <w:r>
-        <w:rPr>
-          <w:b/>
-          <w:bCs/>
-          <w:color w:val="000000" w:themeColor="text1"/>
-        </w:rPr>
-        <w:t>hoti</w:t>
-      </w:r>
-      <w:proofErr w:type="spellEnd"/>
-      <w:r>
-        <w:rPr>
-          <w:b/>
-          <w:bCs/>
-          <w:color w:val="000000" w:themeColor="text1"/>
-        </w:rPr>
-        <w:t xml:space="preserve"> h (n-1) </w:t>
-      </w:r>
-      <w:proofErr w:type="spellStart"/>
-      <w:r>
-        <w:rPr>
-          <w:b/>
-          <w:bCs/>
-          <w:color w:val="000000" w:themeColor="text1"/>
-        </w:rPr>
-        <w:t>tak</w:t>
-      </w:r>
-      <w:proofErr w:type="spellEnd"/>
-      <w:r>
-        <w:rPr>
-          <w:b/>
-          <w:bCs/>
-          <w:color w:val="000000" w:themeColor="text1"/>
-        </w:rPr>
-        <w:t xml:space="preserve"> </w:t>
-      </w:r>
-      <w:proofErr w:type="spellStart"/>
-      <w:r>
-        <w:rPr>
-          <w:b/>
-          <w:bCs/>
-          <w:color w:val="000000" w:themeColor="text1"/>
-        </w:rPr>
-        <w:t>chalti</w:t>
-      </w:r>
-      <w:proofErr w:type="spellEnd"/>
-      <w:r>
-        <w:rPr>
-          <w:b/>
-          <w:bCs/>
-          <w:color w:val="000000" w:themeColor="text1"/>
-        </w:rPr>
-        <w:t xml:space="preserve"> h </w:t>
-      </w:r>
-    </w:p>
-    <w:p>
-      <w:pPr>
-        <w:rPr>
-          <w:b/>
-          <w:bCs/>
-          <w:color w:val="000000" w:themeColor="text1"/>
-        </w:rPr>
-      </w:pPr>
-      <w:proofErr w:type="spellStart"/>
-      <w:r>
-        <w:rPr>
-          <w:b/>
-          <w:bCs/>
-          <w:color w:val="000000" w:themeColor="text1"/>
-        </w:rPr>
-        <w:t>names.add</w:t>
-      </w:r>
-      <w:proofErr w:type="spellEnd"/>
-      <w:r>
-        <w:rPr>
-          <w:b/>
-          <w:bCs/>
-          <w:color w:val="000000" w:themeColor="text1"/>
-        </w:rPr>
-        <w:t>("</w:t>
-      </w:r>
-      <w:r>
-        <w:rPr>
-          <w:b/>
-          <w:bCs/>
-          <w:color w:val="000000" w:themeColor="text1"/>
-        </w:rPr>
-        <w:t>Kalu</w:t>
-      </w:r>
-      <w:r>
-        <w:rPr>
-          <w:b/>
-          <w:bCs/>
-          <w:color w:val="000000" w:themeColor="text1"/>
-        </w:rPr>
-        <w:t>");</w:t>
-      </w:r>
-    </w:p>
-    <w:p>
-      <w:pPr>
-        <w:rPr>
-          <w:b/>
-          <w:bCs/>
-          <w:color w:val="000000" w:themeColor="text1"/>
-        </w:rPr>
-      </w:pPr>
-      <w:proofErr w:type="gramStart"/>
-      <w:r>
-        <w:rPr>
-          <w:b/>
-          <w:bCs/>
-          <w:color w:val="000000" w:themeColor="text1"/>
-        </w:rPr>
-        <w:t>Output :</w:t>
-      </w:r>
-      <w:proofErr w:type="gramEnd"/>
-      <w:r>
-        <w:rPr>
-          <w:b/>
-          <w:bCs/>
-          <w:color w:val="000000" w:themeColor="text1"/>
-        </w:rPr>
-        <w:t xml:space="preserve"> </w:t>
-      </w:r>
-      <w:r>
-        <w:rPr>
-          <w:b/>
-          <w:bCs/>
-          <w:color w:val="000000" w:themeColor="text1"/>
-        </w:rPr>
-        <w:t xml:space="preserve">[Abhi, Rahul, </w:t>
-      </w:r>
-      <w:proofErr w:type="gramStart"/>
-      <w:r>
-        <w:rPr>
-          <w:b/>
-          <w:bCs/>
-          <w:color w:val="000000" w:themeColor="text1"/>
-        </w:rPr>
-        <w:t>Kartik ,</w:t>
-      </w:r>
-      <w:proofErr w:type="gramEnd"/>
-      <w:r>
-        <w:rPr>
-          <w:b/>
-          <w:bCs/>
-          <w:color w:val="000000" w:themeColor="text1"/>
-        </w:rPr>
-        <w:t xml:space="preserve"> Kalu</w:t>
-      </w:r>
-      <w:r>
-        <w:rPr>
-          <w:b/>
-          <w:bCs/>
-          <w:color w:val="000000" w:themeColor="text1"/>
-        </w:rPr>
-        <w:t>]</w:t>
-      </w:r>
-    </w:p>
-    <w:p>
-      <w:pPr>
-        <w:rPr>
-          <w:b/>
-          <w:bCs/>
-          <w:color w:val="000000" w:themeColor="text1"/>
-        </w:rPr>
-      </w:pPr>
-      <w:r>
-        <w:rPr>
-          <w:b/>
-          <w:bCs/>
-          <w:color w:val="000000" w:themeColor="text1"/>
-        </w:rPr>
-        <w:t>Remove.name(“Kalu”);4</w:t>
-      </w:r>
-    </w:p>
-    <w:p>
-      <w:pPr>
-        <w:rPr>
-          <w:b/>
-          <w:bCs/>
-          <w:color w:val="000000" w:themeColor="text1"/>
-        </w:rPr>
-      </w:pPr>
-      <w:r>
-        <w:rPr>
-          <w:b/>
-          <w:bCs/>
-          <w:color w:val="000000" w:themeColor="text1"/>
-        </w:rPr>
-        <w:t xml:space="preserve">Output: </w:t>
-      </w:r>
-      <w:r>
-        <w:rPr>
-          <w:b/>
-          <w:bCs/>
-          <w:color w:val="000000" w:themeColor="text1"/>
-        </w:rPr>
-        <w:t xml:space="preserve">[Abhi, Rahul, </w:t>
-      </w:r>
-      <w:r>
-        <w:rPr>
-          <w:b/>
-          <w:bCs/>
-          <w:color w:val="000000" w:themeColor="text1"/>
-        </w:rPr>
-        <w:t>Kartik</w:t>
-      </w:r>
-      <w:r>
-        <w:rPr>
-          <w:b/>
-          <w:bCs/>
-          <w:color w:val="000000" w:themeColor="text1"/>
-        </w:rPr>
-        <w:t>]</w:t>
-      </w:r>
-    </w:p>
-    <w:p>
-      <w:pPr>
-        <w:rPr>
-          <w:b/>
-          <w:bCs/>
-          <w:color w:val="000000" w:themeColor="text1"/>
-        </w:rPr>
-      </w:pPr>
-    </w:p>
-    <w:p>
-      <w:pPr>
-        <w:rPr>
-          <w:b/>
-          <w:bCs/>
-          <w:color w:val="000000" w:themeColor="text1"/>
-        </w:rPr>
-      </w:pPr>
-      <w:r>
-        <w:rPr>
-          <w:b/>
-          <w:bCs/>
-          <w:color w:val="000000" w:themeColor="text1"/>
-        </w:rPr>
-        <w:t xml:space="preserve">Topic 7: </w:t>
-      </w:r>
-      <w:r>
-        <w:rPr>
-          <w:b/>
-          <w:bCs/>
-          <w:color w:val="EE0000"/>
-        </w:rPr>
-        <w:t>Map</w:t>
-      </w:r>
-      <w:proofErr w:type="gramStart"/>
-      <w:r>
-        <w:rPr>
-          <w:b/>
-          <w:bCs/>
-          <w:color w:val="000000" w:themeColor="text1"/>
-        </w:rPr>
-        <w:t xml:space="preserve">:  </w:t>
-      </w:r>
-      <w:r>
-        <w:rPr>
-          <w:b/>
-          <w:bCs/>
-          <w:color w:val="000000" w:themeColor="text1"/>
-        </w:rPr>
-        <w:t>key</w:t>
-      </w:r>
-      <w:proofErr w:type="gramEnd"/>
-      <w:r>
-        <w:rPr>
-          <w:b/>
-          <w:bCs/>
-          <w:color w:val="000000" w:themeColor="text1"/>
-        </w:rPr>
-        <w:t xml:space="preserve"> + value pair me data store </w:t>
-      </w:r>
-      <w:proofErr w:type="spellStart"/>
-      <w:r>
-        <w:rPr>
-          <w:b/>
-          <w:bCs/>
-          <w:color w:val="000000" w:themeColor="text1"/>
-        </w:rPr>
-        <w:t>karta</w:t>
-      </w:r>
-      <w:proofErr w:type="spellEnd"/>
-      <w:r>
-        <w:rPr>
-          <w:b/>
-          <w:bCs/>
-          <w:color w:val="000000" w:themeColor="text1"/>
-        </w:rPr>
-        <w:t xml:space="preserve"> h.</w:t>
+        <w:t>key + value pair me data store karta h.</w:t>
       </w:r>
     </w:p>
     <w:tbl>
@@ -2367,25 +1545,7 @@
                 <w:bCs/>
                 <w:color w:val="000000" w:themeColor="text1"/>
               </w:rPr>
-              <w:t xml:space="preserve">   "name</w:t>
-            </w:r>
-            <w:proofErr w:type="gramStart"/>
-            <w:r>
-              <w:rPr>
-                <w:b/>
-                <w:bCs/>
-                <w:color w:val="000000" w:themeColor="text1"/>
-              </w:rPr>
-              <w:t>" :</w:t>
-            </w:r>
-            <w:proofErr w:type="gramEnd"/>
-            <w:r>
-              <w:rPr>
-                <w:b/>
-                <w:bCs/>
-                <w:color w:val="000000" w:themeColor="text1"/>
-              </w:rPr>
-              <w:t xml:space="preserve"> "Abhi",</w:t>
+              <w:t xml:space="preserve">   "name" : "Abhi",</w:t>
             </w:r>
           </w:p>
           <w:p>
@@ -2402,25 +1562,7 @@
                 <w:bCs/>
                 <w:color w:val="000000" w:themeColor="text1"/>
               </w:rPr>
-              <w:t xml:space="preserve">   "age</w:t>
-            </w:r>
-            <w:proofErr w:type="gramStart"/>
-            <w:r>
-              <w:rPr>
-                <w:b/>
-                <w:bCs/>
-                <w:color w:val="000000" w:themeColor="text1"/>
-              </w:rPr>
-              <w:t>" :</w:t>
-            </w:r>
-            <w:proofErr w:type="gramEnd"/>
-            <w:r>
-              <w:rPr>
-                <w:b/>
-                <w:bCs/>
-                <w:color w:val="000000" w:themeColor="text1"/>
-              </w:rPr>
-              <w:t xml:space="preserve"> 19,</w:t>
+              <w:t xml:space="preserve">   "age" : 19,</w:t>
             </w:r>
           </w:p>
           <w:p>
@@ -2437,25 +1579,7 @@
                 <w:bCs/>
                 <w:color w:val="000000" w:themeColor="text1"/>
               </w:rPr>
-              <w:t xml:space="preserve">   "city</w:t>
-            </w:r>
-            <w:proofErr w:type="gramStart"/>
-            <w:r>
-              <w:rPr>
-                <w:b/>
-                <w:bCs/>
-                <w:color w:val="000000" w:themeColor="text1"/>
-              </w:rPr>
-              <w:t>" :</w:t>
-            </w:r>
-            <w:proofErr w:type="gramEnd"/>
-            <w:r>
-              <w:rPr>
-                <w:b/>
-                <w:bCs/>
-                <w:color w:val="000000" w:themeColor="text1"/>
-              </w:rPr>
-              <w:t xml:space="preserve"> "Ajmer"</w:t>
+              <w:t xml:space="preserve">   "city" : "Ajmer"</w:t>
             </w:r>
           </w:p>
           <w:p>
@@ -2509,8 +1633,6 @@
                 <w:color w:val="000000" w:themeColor="text1"/>
               </w:rPr>
             </w:pPr>
-            <w:proofErr w:type="spellStart"/>
-            <w:proofErr w:type="gramStart"/>
             <w:r>
               <w:rPr>
                 <w:b/>
@@ -2519,8 +1641,6 @@
               </w:rPr>
               <w:t>Output:Abhi</w:t>
             </w:r>
-            <w:proofErr w:type="spellEnd"/>
-            <w:proofErr w:type="gramEnd"/>
           </w:p>
           <w:p>
             <w:pPr>
@@ -2571,9 +1691,1905 @@
         <w:rPr>
           <w:b/>
           <w:bCs/>
-          <w:color w:val="000000" w:themeColor="text1"/>
-        </w:rPr>
-      </w:pPr>
+          <w:color w:val="00B0F0"/>
+        </w:rPr>
+      </w:pPr>
+      <w:r>
+        <w:rPr>
+          <w:b/>
+          <w:bCs/>
+          <w:color w:val="00B0F0"/>
+        </w:rPr>
+        <w:lastRenderedPageBreak/>
+        <w:t>http Package in Flutter</w:t>
+      </w:r>
+    </w:p>
+    <w:p>
+      <w:pPr>
+        <w:rPr>
+          <w:b/>
+          <w:bCs/>
+          <w:color w:val="00B0F0"/>
+        </w:rPr>
+      </w:pPr>
+      <w:r>
+        <w:rPr>
+          <w:b/>
+          <w:bCs/>
+          <w:color w:val="00B0F0"/>
+        </w:rPr>
+        <w:t>The http package is used in Flutter to fetch data from the internet or APIs.</w:t>
+      </w:r>
+      <w:r>
+        <w:rPr>
+          <w:b/>
+          <w:bCs/>
+          <w:color w:val="00B0F0"/>
+        </w:rPr>
+        <w:br/>
+        <w:t>It helps the application send requests to the server and receive responses.</w:t>
+      </w:r>
+    </w:p>
+    <w:p>
+      <w:pPr>
+        <w:rPr>
+          <w:b/>
+          <w:bCs/>
+          <w:color w:val="00B0F0"/>
+        </w:rPr>
+      </w:pPr>
+      <w:r>
+        <w:rPr>
+          <w:b/>
+          <w:bCs/>
+          <w:color w:val="00B0F0"/>
+        </w:rPr>
+        <w:t>dependencies:</w:t>
+      </w:r>
+    </w:p>
+    <w:p>
+      <w:pPr>
+        <w:rPr>
+          <w:b/>
+          <w:bCs/>
+          <w:color w:val="00B0F0"/>
+        </w:rPr>
+      </w:pPr>
+      <w:r>
+        <w:rPr>
+          <w:b/>
+          <w:bCs/>
+          <w:color w:val="00B0F0"/>
+        </w:rPr>
+        <w:t xml:space="preserve">  http: ^1.5.0</w:t>
+      </w:r>
+    </w:p>
+    <w:p>
+      <w:pPr>
+        <w:rPr>
+          <w:b/>
+          <w:bCs/>
+          <w:color w:val="00B0F0"/>
+        </w:rPr>
+      </w:pPr>
+      <w:r>
+        <w:rPr>
+          <w:b/>
+          <w:bCs/>
+          <w:color w:val="00B0F0"/>
+        </w:rPr>
+        <w:t>import 'package:http/http.dart' as http;</w:t>
+      </w:r>
+    </w:p>
+    <w:p>
+      <w:pPr>
+        <w:rPr>
+          <w:b/>
+          <w:bCs/>
+          <w:color w:val="00B0F0"/>
+        </w:rPr>
+      </w:pPr>
+    </w:p>
+    <w:p>
+      <w:pPr>
+        <w:rPr>
+          <w:b/>
+          <w:bCs/>
+          <w:color w:val="EE0000"/>
+        </w:rPr>
+      </w:pPr>
+      <w:r>
+        <w:rPr>
+          <w:b/>
+          <w:bCs/>
+          <w:color w:val="EE0000"/>
+        </w:rPr>
+        <w:t>Topic 8 –</w:t>
+      </w:r>
+    </w:p>
+    <w:p>
+      <w:pPr>
+        <w:rPr>
+          <w:b/>
+          <w:bCs/>
+          <w:color w:val="000000" w:themeColor="text1"/>
+        </w:rPr>
+      </w:pPr>
+      <w:r>
+        <w:rPr>
+          <w:b/>
+          <w:bCs/>
+          <w:color w:val="000000" w:themeColor="text1"/>
+        </w:rPr>
+        <w:t xml:space="preserve">  named parameter = parameter ko name ke saath pass karna </w:t>
+      </w:r>
+    </w:p>
+    <w:p>
+      <w:pPr>
+        <w:rPr>
+          <w:b/>
+          <w:bCs/>
+          <w:color w:val="000000" w:themeColor="text1"/>
+        </w:rPr>
+      </w:pPr>
+      <w:r>
+        <w:rPr>
+          <w:b/>
+          <w:bCs/>
+          <w:color w:val="000000" w:themeColor="text1"/>
+        </w:rPr>
+        <w:t xml:space="preserve">  readable aur clear hota h </w:t>
+      </w:r>
+    </w:p>
+    <w:p>
+      <w:pPr>
+        <w:rPr>
+          <w:b/>
+          <w:bCs/>
+          <w:color w:val="000000" w:themeColor="text1"/>
+        </w:rPr>
+      </w:pPr>
+      <w:r>
+        <w:rPr>
+          <w:b/>
+          <w:bCs/>
+          <w:color w:val="000000" w:themeColor="text1"/>
+        </w:rPr>
+        <w:t>  Flutter me bahut use hota h</w:t>
+      </w:r>
+    </w:p>
+    <w:p>
+      <w:pPr>
+        <w:rPr>
+          <w:b/>
+          <w:bCs/>
+          <w:color w:val="000000" w:themeColor="text1"/>
+        </w:rPr>
+      </w:pPr>
+      <w:r>
+        <w:rPr>
+          <w:b/>
+          <w:bCs/>
+          <w:color w:val="EE0000"/>
+        </w:rPr>
+        <w:t xml:space="preserve">Syntax </w:t>
+      </w:r>
+      <w:r>
+        <w:rPr>
+          <w:b/>
+          <w:bCs/>
+          <w:color w:val="000000" w:themeColor="text1"/>
+        </w:rPr>
+        <w:t xml:space="preserve">- </w:t>
+      </w:r>
+      <w:r>
+        <w:rPr>
+          <w:b/>
+          <w:bCs/>
+          <w:color w:val="000000" w:themeColor="text1"/>
+        </w:rPr>
+        <w:t>void greet({String? name})</w:t>
+      </w:r>
+    </w:p>
+    <w:p>
+      <w:pPr>
+        <w:rPr>
+          <w:b/>
+          <w:bCs/>
+          <w:color w:val="000000" w:themeColor="text1"/>
+        </w:rPr>
+      </w:pPr>
+      <w:r>
+        <w:rPr>
+          <w:b/>
+          <w:bCs/>
+          <w:color w:val="000000" w:themeColor="text1"/>
+        </w:rPr>
+        <w:t>{</w:t>
+      </w:r>
+    </w:p>
+    <w:p>
+      <w:pPr>
+        <w:rPr>
+          <w:b/>
+          <w:bCs/>
+          <w:color w:val="000000" w:themeColor="text1"/>
+        </w:rPr>
+      </w:pPr>
+      <w:r>
+        <w:rPr>
+          <w:b/>
+          <w:bCs/>
+          <w:color w:val="000000" w:themeColor="text1"/>
+        </w:rPr>
+        <w:t xml:space="preserve">   print(name);</w:t>
+      </w:r>
+    </w:p>
+    <w:p>
+      <w:pPr>
+        <w:rPr>
+          <w:b/>
+          <w:bCs/>
+          <w:color w:val="000000" w:themeColor="text1"/>
+        </w:rPr>
+      </w:pPr>
+      <w:r>
+        <w:rPr>
+          <w:b/>
+          <w:bCs/>
+          <w:color w:val="000000" w:themeColor="text1"/>
+        </w:rPr>
+        <w:t>}</w:t>
+      </w:r>
+    </w:p>
+    <w:p>
+      <w:pPr>
+        <w:rPr>
+          <w:b/>
+          <w:bCs/>
+          <w:color w:val="000000" w:themeColor="text1"/>
+        </w:rPr>
+      </w:pPr>
+    </w:p>
+    <w:p>
+      <w:pPr>
+        <w:rPr>
+          <w:b/>
+          <w:bCs/>
+          <w:color w:val="000000" w:themeColor="text1"/>
+        </w:rPr>
+      </w:pPr>
+      <w:r>
+        <w:rPr>
+          <w:b/>
+          <w:bCs/>
+          <w:color w:val="000000" w:themeColor="text1"/>
+        </w:rPr>
+        <w:t>Function Call</w:t>
+      </w:r>
+      <w:r>
+        <w:rPr>
+          <w:b/>
+          <w:bCs/>
+          <w:color w:val="000000" w:themeColor="text1"/>
+        </w:rPr>
+        <w:t xml:space="preserve">- </w:t>
+      </w:r>
+      <w:r>
+        <w:rPr>
+          <w:b/>
+          <w:bCs/>
+          <w:color w:val="000000" w:themeColor="text1"/>
+        </w:rPr>
+        <w:t>greet(name: "Abhi");</w:t>
+      </w:r>
+    </w:p>
+    <w:p>
+      <w:pPr>
+        <w:rPr>
+          <w:b/>
+          <w:bCs/>
+          <w:color w:val="000000" w:themeColor="text1"/>
+        </w:rPr>
+      </w:pPr>
+      <w:r>
+        <w:rPr>
+          <w:b/>
+          <w:bCs/>
+          <w:color w:val="000000" w:themeColor="text1"/>
+        </w:rPr>
+        <w:t>Output : Abhi</w:t>
+      </w:r>
+    </w:p>
+    <w:p>
+      <w:pPr>
+        <w:rPr>
+          <w:b/>
+          <w:bCs/>
+          <w:color w:val="000000" w:themeColor="text1"/>
+        </w:rPr>
+      </w:pPr>
+      <w:r>
+        <w:rPr>
+          <w:b/>
+          <w:bCs/>
+          <w:color w:val="000000" w:themeColor="text1"/>
+        </w:rPr>
+        <w:t xml:space="preserve">Eg. </w:t>
+      </w:r>
+      <w:r>
+        <w:rPr>
+          <w:b/>
+          <w:bCs/>
+          <w:color w:val="000000" w:themeColor="text1"/>
+        </w:rPr>
+        <w:t>sum(a:10,b:20)</w:t>
+      </w:r>
+    </w:p>
+    <w:p>
+      <w:pPr>
+        <w:rPr>
+          <w:b/>
+          <w:bCs/>
+          <w:color w:val="000000" w:themeColor="text1"/>
+        </w:rPr>
+      </w:pPr>
+    </w:p>
+    <w:p>
+      <w:pPr>
+        <w:rPr>
+          <w:b/>
+          <w:bCs/>
+          <w:color w:val="EE0000"/>
+        </w:rPr>
+      </w:pPr>
+    </w:p>
+    <w:p>
+      <w:pPr>
+        <w:rPr>
+          <w:b/>
+          <w:bCs/>
+          <w:color w:val="EE0000"/>
+        </w:rPr>
+      </w:pPr>
+      <w:r>
+        <w:rPr>
+          <w:b/>
+          <w:bCs/>
+          <w:color w:val="EE0000"/>
+        </w:rPr>
+        <w:t xml:space="preserve">Topic </w:t>
+      </w:r>
+      <w:r>
+        <w:rPr>
+          <w:b/>
+          <w:bCs/>
+          <w:color w:val="EE0000"/>
+        </w:rPr>
+        <w:t>9</w:t>
+      </w:r>
+      <w:r>
+        <w:rPr>
+          <w:b/>
+          <w:bCs/>
+          <w:color w:val="EE0000"/>
+        </w:rPr>
+        <w:t xml:space="preserve"> : Async &amp; Await</w:t>
+      </w:r>
+    </w:p>
+    <w:p>
+      <w:pPr>
+        <w:rPr>
+          <w:b/>
+          <w:bCs/>
+          <w:color w:val="000000" w:themeColor="text1"/>
+        </w:rPr>
+      </w:pPr>
+    </w:p>
+    <w:p>
+      <w:pPr>
+        <w:rPr>
+          <w:b/>
+          <w:bCs/>
+          <w:color w:val="000000" w:themeColor="text1"/>
+        </w:rPr>
+      </w:pPr>
+      <w:r>
+        <w:rPr>
+          <w:b/>
+          <w:bCs/>
+          <w:color w:val="000000" w:themeColor="text1"/>
+        </w:rPr>
+        <w:t>--------------------------------------------------</w:t>
+      </w:r>
+    </w:p>
+    <w:p>
+      <w:pPr>
+        <w:rPr>
+          <w:b/>
+          <w:bCs/>
+          <w:color w:val="000000" w:themeColor="text1"/>
+        </w:rPr>
+      </w:pPr>
+    </w:p>
+    <w:p>
+      <w:pPr>
+        <w:rPr>
+          <w:b/>
+          <w:bCs/>
+          <w:color w:val="000000" w:themeColor="text1"/>
+        </w:rPr>
+      </w:pPr>
+      <w:r>
+        <w:rPr>
+          <w:b/>
+          <w:bCs/>
+          <w:color w:val="000000" w:themeColor="text1"/>
+        </w:rPr>
+        <w:t>Async</w:t>
+      </w:r>
+    </w:p>
+    <w:p>
+      <w:pPr>
+        <w:rPr>
+          <w:b/>
+          <w:bCs/>
+          <w:color w:val="000000" w:themeColor="text1"/>
+        </w:rPr>
+      </w:pPr>
+      <w:r>
+        <w:rPr>
+          <w:b/>
+          <w:bCs/>
+          <w:color w:val="000000" w:themeColor="text1"/>
+        </w:rPr>
+        <w:lastRenderedPageBreak/>
+        <w:t>- async = time lene wala kaam</w:t>
+      </w:r>
+    </w:p>
+    <w:p>
+      <w:pPr>
+        <w:rPr>
+          <w:b/>
+          <w:bCs/>
+          <w:color w:val="000000" w:themeColor="text1"/>
+        </w:rPr>
+      </w:pPr>
+      <w:r>
+        <w:rPr>
+          <w:b/>
+          <w:bCs/>
+          <w:color w:val="000000" w:themeColor="text1"/>
+        </w:rPr>
+        <w:t>- API, Internet, Firebase, Database me use hota h</w:t>
+      </w:r>
+    </w:p>
+    <w:p>
+      <w:pPr>
+        <w:rPr>
+          <w:b/>
+          <w:bCs/>
+          <w:color w:val="000000" w:themeColor="text1"/>
+        </w:rPr>
+      </w:pPr>
+      <w:r>
+        <w:rPr>
+          <w:b/>
+          <w:bCs/>
+          <w:color w:val="000000" w:themeColor="text1"/>
+        </w:rPr>
+        <w:t>- function ko asynchronous banata h</w:t>
+      </w:r>
+    </w:p>
+    <w:p>
+      <w:pPr>
+        <w:rPr>
+          <w:b/>
+          <w:bCs/>
+          <w:color w:val="000000" w:themeColor="text1"/>
+        </w:rPr>
+      </w:pPr>
+    </w:p>
+    <w:p>
+      <w:pPr>
+        <w:rPr>
+          <w:b/>
+          <w:bCs/>
+          <w:color w:val="000000" w:themeColor="text1"/>
+        </w:rPr>
+      </w:pPr>
+      <w:r>
+        <w:rPr>
+          <w:b/>
+          <w:bCs/>
+          <w:color w:val="000000" w:themeColor="text1"/>
+        </w:rPr>
+        <w:t>--------------------------------------------------</w:t>
+      </w:r>
+    </w:p>
+    <w:p>
+      <w:pPr>
+        <w:rPr>
+          <w:b/>
+          <w:bCs/>
+          <w:color w:val="000000" w:themeColor="text1"/>
+        </w:rPr>
+      </w:pPr>
+    </w:p>
+    <w:p>
+      <w:pPr>
+        <w:rPr>
+          <w:b/>
+          <w:bCs/>
+          <w:color w:val="000000" w:themeColor="text1"/>
+        </w:rPr>
+      </w:pPr>
+      <w:r>
+        <w:rPr>
+          <w:b/>
+          <w:bCs/>
+          <w:color w:val="000000" w:themeColor="text1"/>
+        </w:rPr>
+        <w:t>Syntax</w:t>
+      </w:r>
+    </w:p>
+    <w:p>
+      <w:pPr>
+        <w:rPr>
+          <w:b/>
+          <w:bCs/>
+          <w:color w:val="000000" w:themeColor="text1"/>
+        </w:rPr>
+      </w:pPr>
+    </w:p>
+    <w:p>
+      <w:pPr>
+        <w:rPr>
+          <w:b/>
+          <w:bCs/>
+          <w:color w:val="000000" w:themeColor="text1"/>
+        </w:rPr>
+      </w:pPr>
+      <w:r>
+        <w:rPr>
+          <w:b/>
+          <w:bCs/>
+          <w:color w:val="000000" w:themeColor="text1"/>
+        </w:rPr>
+        <w:t>void getData() async</w:t>
+      </w:r>
+    </w:p>
+    <w:p>
+      <w:pPr>
+        <w:rPr>
+          <w:b/>
+          <w:bCs/>
+          <w:color w:val="000000" w:themeColor="text1"/>
+        </w:rPr>
+      </w:pPr>
+      <w:r>
+        <w:rPr>
+          <w:b/>
+          <w:bCs/>
+          <w:color w:val="000000" w:themeColor="text1"/>
+        </w:rPr>
+        <w:t>{</w:t>
+      </w:r>
+    </w:p>
+    <w:p>
+      <w:pPr>
+        <w:rPr>
+          <w:b/>
+          <w:bCs/>
+          <w:color w:val="000000" w:themeColor="text1"/>
+        </w:rPr>
+      </w:pPr>
+    </w:p>
+    <w:p>
+      <w:pPr>
+        <w:rPr>
+          <w:b/>
+          <w:bCs/>
+          <w:color w:val="000000" w:themeColor="text1"/>
+        </w:rPr>
+      </w:pPr>
+      <w:r>
+        <w:rPr>
+          <w:b/>
+          <w:bCs/>
+          <w:color w:val="000000" w:themeColor="text1"/>
+        </w:rPr>
+        <w:t>}</w:t>
+      </w:r>
+    </w:p>
+    <w:p>
+      <w:pPr>
+        <w:rPr>
+          <w:b/>
+          <w:bCs/>
+          <w:color w:val="000000" w:themeColor="text1"/>
+        </w:rPr>
+      </w:pPr>
+    </w:p>
+    <w:p>
+      <w:pPr>
+        <w:rPr>
+          <w:b/>
+          <w:bCs/>
+          <w:color w:val="000000" w:themeColor="text1"/>
+        </w:rPr>
+      </w:pPr>
+      <w:r>
+        <w:rPr>
+          <w:b/>
+          <w:bCs/>
+          <w:color w:val="000000" w:themeColor="text1"/>
+        </w:rPr>
+        <w:t>--------------------------------------------------</w:t>
+      </w:r>
+    </w:p>
+    <w:p>
+      <w:pPr>
+        <w:rPr>
+          <w:b/>
+          <w:bCs/>
+          <w:color w:val="000000" w:themeColor="text1"/>
+        </w:rPr>
+      </w:pPr>
+    </w:p>
+    <w:p>
+      <w:pPr>
+        <w:rPr>
+          <w:b/>
+          <w:bCs/>
+          <w:color w:val="000000" w:themeColor="text1"/>
+        </w:rPr>
+      </w:pPr>
+      <w:r>
+        <w:rPr>
+          <w:b/>
+          <w:bCs/>
+          <w:color w:val="000000" w:themeColor="text1"/>
+        </w:rPr>
+        <w:t>Await</w:t>
+      </w:r>
+    </w:p>
+    <w:p>
+      <w:pPr>
+        <w:rPr>
+          <w:b/>
+          <w:bCs/>
+          <w:color w:val="000000" w:themeColor="text1"/>
+        </w:rPr>
+      </w:pPr>
+      <w:r>
+        <w:rPr>
+          <w:b/>
+          <w:bCs/>
+          <w:color w:val="000000" w:themeColor="text1"/>
+        </w:rPr>
+        <w:t>- await = wait karo jab tak kaam complete na ho</w:t>
+      </w:r>
+    </w:p>
+    <w:p>
+      <w:pPr>
+        <w:rPr>
+          <w:b/>
+          <w:bCs/>
+          <w:color w:val="000000" w:themeColor="text1"/>
+        </w:rPr>
+      </w:pPr>
+    </w:p>
+    <w:p>
+      <w:pPr>
+        <w:rPr>
+          <w:b/>
+          <w:bCs/>
+          <w:color w:val="000000" w:themeColor="text1"/>
+        </w:rPr>
+      </w:pPr>
+      <w:r>
+        <w:rPr>
+          <w:b/>
+          <w:bCs/>
+          <w:color w:val="000000" w:themeColor="text1"/>
+        </w:rPr>
+        <w:t>--------------------------------------------------</w:t>
+      </w:r>
+    </w:p>
+    <w:p>
+      <w:pPr>
+        <w:rPr>
+          <w:b/>
+          <w:bCs/>
+          <w:color w:val="000000" w:themeColor="text1"/>
+        </w:rPr>
+      </w:pPr>
+    </w:p>
+    <w:p>
+      <w:pPr>
+        <w:rPr>
+          <w:b/>
+          <w:bCs/>
+          <w:color w:val="000000" w:themeColor="text1"/>
+        </w:rPr>
+      </w:pPr>
+      <w:r>
+        <w:rPr>
+          <w:b/>
+          <w:bCs/>
+          <w:color w:val="000000" w:themeColor="text1"/>
+        </w:rPr>
+        <w:t>Example</w:t>
+      </w:r>
+    </w:p>
+    <w:p>
+      <w:pPr>
+        <w:rPr>
+          <w:b/>
+          <w:bCs/>
+          <w:color w:val="000000" w:themeColor="text1"/>
+        </w:rPr>
+      </w:pPr>
+    </w:p>
+    <w:p>
+      <w:pPr>
+        <w:rPr>
+          <w:b/>
+          <w:bCs/>
+          <w:color w:val="000000" w:themeColor="text1"/>
+        </w:rPr>
+      </w:pPr>
+      <w:r>
+        <w:rPr>
+          <w:b/>
+          <w:bCs/>
+          <w:color w:val="000000" w:themeColor="text1"/>
+        </w:rPr>
+        <w:t>void getData() async</w:t>
+      </w:r>
+    </w:p>
+    <w:p>
+      <w:pPr>
+        <w:rPr>
+          <w:b/>
+          <w:bCs/>
+          <w:color w:val="000000" w:themeColor="text1"/>
+        </w:rPr>
+      </w:pPr>
+      <w:r>
+        <w:rPr>
+          <w:b/>
+          <w:bCs/>
+          <w:color w:val="000000" w:themeColor="text1"/>
+        </w:rPr>
+        <w:t>{</w:t>
+      </w:r>
+    </w:p>
+    <w:p>
+      <w:pPr>
+        <w:rPr>
+          <w:b/>
+          <w:bCs/>
+          <w:color w:val="000000" w:themeColor="text1"/>
+        </w:rPr>
+      </w:pPr>
+      <w:r>
+        <w:rPr>
+          <w:b/>
+          <w:bCs/>
+          <w:color w:val="000000" w:themeColor="text1"/>
+        </w:rPr>
+        <w:t xml:space="preserve">   print("Loading...");</w:t>
+      </w:r>
+    </w:p>
+    <w:p>
+      <w:pPr>
+        <w:rPr>
+          <w:b/>
+          <w:bCs/>
+          <w:color w:val="000000" w:themeColor="text1"/>
+        </w:rPr>
+      </w:pPr>
+    </w:p>
+    <w:p>
+      <w:pPr>
+        <w:rPr>
+          <w:b/>
+          <w:bCs/>
+          <w:color w:val="000000" w:themeColor="text1"/>
+        </w:rPr>
+      </w:pPr>
+      <w:r>
+        <w:rPr>
+          <w:b/>
+          <w:bCs/>
+          <w:color w:val="000000" w:themeColor="text1"/>
+        </w:rPr>
+        <w:lastRenderedPageBreak/>
+        <w:t xml:space="preserve">   await Future.delayed(Duration(seconds: 2));</w:t>
+      </w:r>
+    </w:p>
+    <w:p>
+      <w:pPr>
+        <w:rPr>
+          <w:b/>
+          <w:bCs/>
+          <w:color w:val="000000" w:themeColor="text1"/>
+        </w:rPr>
+      </w:pPr>
+    </w:p>
+    <w:p>
+      <w:pPr>
+        <w:rPr>
+          <w:b/>
+          <w:bCs/>
+          <w:color w:val="000000" w:themeColor="text1"/>
+        </w:rPr>
+      </w:pPr>
+      <w:r>
+        <w:rPr>
+          <w:b/>
+          <w:bCs/>
+          <w:color w:val="000000" w:themeColor="text1"/>
+        </w:rPr>
+        <w:t xml:space="preserve">   print("Data Loaded");</w:t>
+      </w:r>
+    </w:p>
+    <w:p>
+      <w:pPr>
+        <w:rPr>
+          <w:b/>
+          <w:bCs/>
+          <w:color w:val="000000" w:themeColor="text1"/>
+        </w:rPr>
+      </w:pPr>
+      <w:r>
+        <w:rPr>
+          <w:b/>
+          <w:bCs/>
+          <w:color w:val="000000" w:themeColor="text1"/>
+        </w:rPr>
+        <w:t>}</w:t>
+      </w:r>
+    </w:p>
+    <w:p>
+      <w:pPr>
+        <w:rPr>
+          <w:b/>
+          <w:bCs/>
+          <w:color w:val="000000" w:themeColor="text1"/>
+        </w:rPr>
+      </w:pPr>
+    </w:p>
+    <w:p>
+      <w:pPr>
+        <w:rPr>
+          <w:b/>
+          <w:bCs/>
+          <w:color w:val="000000" w:themeColor="text1"/>
+        </w:rPr>
+      </w:pPr>
+      <w:r>
+        <w:rPr>
+          <w:b/>
+          <w:bCs/>
+          <w:color w:val="000000" w:themeColor="text1"/>
+        </w:rPr>
+        <w:t>--------------------------------------------------</w:t>
+      </w:r>
+    </w:p>
+    <w:p>
+      <w:pPr>
+        <w:rPr>
+          <w:b/>
+          <w:bCs/>
+          <w:color w:val="000000" w:themeColor="text1"/>
+        </w:rPr>
+      </w:pPr>
+    </w:p>
+    <w:p>
+      <w:pPr>
+        <w:rPr>
+          <w:b/>
+          <w:bCs/>
+          <w:color w:val="000000" w:themeColor="text1"/>
+        </w:rPr>
+      </w:pPr>
+      <w:r>
+        <w:rPr>
+          <w:b/>
+          <w:bCs/>
+          <w:color w:val="000000" w:themeColor="text1"/>
+        </w:rPr>
+        <w:t>Output</w:t>
+      </w:r>
+    </w:p>
+    <w:p>
+      <w:pPr>
+        <w:rPr>
+          <w:b/>
+          <w:bCs/>
+          <w:color w:val="000000" w:themeColor="text1"/>
+        </w:rPr>
+      </w:pPr>
+    </w:p>
+    <w:p>
+      <w:pPr>
+        <w:rPr>
+          <w:b/>
+          <w:bCs/>
+          <w:color w:val="000000" w:themeColor="text1"/>
+        </w:rPr>
+      </w:pPr>
+      <w:r>
+        <w:rPr>
+          <w:b/>
+          <w:bCs/>
+          <w:color w:val="000000" w:themeColor="text1"/>
+        </w:rPr>
+        <w:t>Loading...</w:t>
+      </w:r>
+    </w:p>
+    <w:p>
+      <w:pPr>
+        <w:rPr>
+          <w:b/>
+          <w:bCs/>
+          <w:color w:val="000000" w:themeColor="text1"/>
+        </w:rPr>
+      </w:pPr>
+    </w:p>
+    <w:p>
+      <w:pPr>
+        <w:rPr>
+          <w:b/>
+          <w:bCs/>
+          <w:color w:val="000000" w:themeColor="text1"/>
+        </w:rPr>
+      </w:pPr>
+      <w:r>
+        <w:rPr>
+          <w:b/>
+          <w:bCs/>
+          <w:color w:val="000000" w:themeColor="text1"/>
+        </w:rPr>
+        <w:t>(wait 2 sec)</w:t>
+      </w:r>
+    </w:p>
+    <w:p>
+      <w:pPr>
+        <w:rPr>
+          <w:b/>
+          <w:bCs/>
+          <w:color w:val="000000" w:themeColor="text1"/>
+        </w:rPr>
+      </w:pPr>
+    </w:p>
+    <w:p>
+      <w:pPr>
+        <w:rPr>
+          <w:b/>
+          <w:bCs/>
+          <w:color w:val="000000" w:themeColor="text1"/>
+        </w:rPr>
+      </w:pPr>
+      <w:r>
+        <w:rPr>
+          <w:b/>
+          <w:bCs/>
+          <w:color w:val="000000" w:themeColor="text1"/>
+        </w:rPr>
+        <w:t>Data Loaded</w:t>
+      </w:r>
+    </w:p>
+    <w:p>
+      <w:pPr>
+        <w:rPr>
+          <w:b/>
+          <w:bCs/>
+          <w:color w:val="000000" w:themeColor="text1"/>
+        </w:rPr>
+      </w:pPr>
+    </w:p>
+    <w:p>
+      <w:pPr>
+        <w:rPr>
+          <w:b/>
+          <w:bCs/>
+          <w:color w:val="000000" w:themeColor="text1"/>
+        </w:rPr>
+      </w:pPr>
+      <w:r>
+        <w:rPr>
+          <w:b/>
+          <w:bCs/>
+          <w:color w:val="000000" w:themeColor="text1"/>
+        </w:rPr>
+        <w:t>--------------------------------------------------</w:t>
+      </w:r>
+    </w:p>
+    <w:p>
+      <w:pPr>
+        <w:rPr>
+          <w:b/>
+          <w:bCs/>
+          <w:color w:val="000000" w:themeColor="text1"/>
+        </w:rPr>
+      </w:pPr>
+    </w:p>
+    <w:p>
+      <w:pPr>
+        <w:rPr>
+          <w:b/>
+          <w:bCs/>
+          <w:color w:val="000000" w:themeColor="text1"/>
+        </w:rPr>
+      </w:pPr>
+      <w:r>
+        <w:rPr>
+          <w:b/>
+          <w:bCs/>
+          <w:color w:val="000000" w:themeColor="text1"/>
+        </w:rPr>
+        <w:t>Future</w:t>
+      </w:r>
+    </w:p>
+    <w:p>
+      <w:pPr>
+        <w:rPr>
+          <w:b/>
+          <w:bCs/>
+          <w:color w:val="000000" w:themeColor="text1"/>
+        </w:rPr>
+      </w:pPr>
+      <w:r>
+        <w:rPr>
+          <w:b/>
+          <w:bCs/>
+          <w:color w:val="000000" w:themeColor="text1"/>
+        </w:rPr>
+        <w:t>- future me value milegi</w:t>
+      </w:r>
+    </w:p>
+    <w:p>
+      <w:pPr>
+        <w:rPr>
+          <w:b/>
+          <w:bCs/>
+          <w:color w:val="000000" w:themeColor="text1"/>
+        </w:rPr>
+      </w:pPr>
+    </w:p>
+    <w:p>
+      <w:pPr>
+        <w:rPr>
+          <w:b/>
+          <w:bCs/>
+          <w:color w:val="000000" w:themeColor="text1"/>
+        </w:rPr>
+      </w:pPr>
+      <w:r>
+        <w:rPr>
+          <w:b/>
+          <w:bCs/>
+          <w:color w:val="000000" w:themeColor="text1"/>
+        </w:rPr>
+        <w:t>Future&lt;String&gt;</w:t>
+      </w:r>
+    </w:p>
+    <w:p>
+      <w:pPr>
+        <w:rPr>
+          <w:b/>
+          <w:bCs/>
+          <w:color w:val="000000" w:themeColor="text1"/>
+        </w:rPr>
+      </w:pPr>
+    </w:p>
+    <w:p>
+      <w:pPr>
+        <w:rPr>
+          <w:b/>
+          <w:bCs/>
+          <w:color w:val="000000" w:themeColor="text1"/>
+        </w:rPr>
+      </w:pPr>
+      <w:r>
+        <w:rPr>
+          <w:b/>
+          <w:bCs/>
+          <w:color w:val="000000" w:themeColor="text1"/>
+        </w:rPr>
+        <w:t>Meaning:</w:t>
+      </w:r>
+    </w:p>
+    <w:p>
+      <w:pPr>
+        <w:rPr>
+          <w:b/>
+          <w:bCs/>
+          <w:color w:val="000000" w:themeColor="text1"/>
+        </w:rPr>
+      </w:pPr>
+      <w:r>
+        <w:rPr>
+          <w:b/>
+          <w:bCs/>
+          <w:color w:val="000000" w:themeColor="text1"/>
+        </w:rPr>
+        <w:t>- future me String return hogi</w:t>
+      </w:r>
+    </w:p>
+    <w:p>
+      <w:pPr>
+        <w:rPr>
+          <w:b/>
+          <w:bCs/>
+          <w:color w:val="000000" w:themeColor="text1"/>
+        </w:rPr>
+      </w:pPr>
+    </w:p>
+    <w:p>
+      <w:pPr>
+        <w:rPr>
+          <w:b/>
+          <w:bCs/>
+          <w:color w:val="000000" w:themeColor="text1"/>
+        </w:rPr>
+      </w:pPr>
+      <w:r>
+        <w:rPr>
+          <w:b/>
+          <w:bCs/>
+          <w:color w:val="000000" w:themeColor="text1"/>
+        </w:rPr>
+        <w:t>--------------------------------------------------</w:t>
+      </w:r>
+    </w:p>
+    <w:p>
+      <w:pPr>
+        <w:rPr>
+          <w:b/>
+          <w:bCs/>
+          <w:color w:val="000000" w:themeColor="text1"/>
+        </w:rPr>
+      </w:pPr>
+    </w:p>
+    <w:p>
+      <w:pPr>
+        <w:rPr>
+          <w:b/>
+          <w:bCs/>
+          <w:color w:val="000000" w:themeColor="text1"/>
+        </w:rPr>
+      </w:pPr>
+      <w:r>
+        <w:rPr>
+          <w:b/>
+          <w:bCs/>
+          <w:color w:val="000000" w:themeColor="text1"/>
+        </w:rPr>
+        <w:t>Important Rule</w:t>
+      </w:r>
+    </w:p>
+    <w:p>
+      <w:pPr>
+        <w:rPr>
+          <w:b/>
+          <w:bCs/>
+          <w:color w:val="000000" w:themeColor="text1"/>
+        </w:rPr>
+      </w:pPr>
+      <w:r>
+        <w:rPr>
+          <w:b/>
+          <w:bCs/>
+          <w:color w:val="000000" w:themeColor="text1"/>
+        </w:rPr>
+        <w:t>- await sirf async function ke andar use hota h</w:t>
+      </w:r>
+    </w:p>
+    <w:p>
+      <w:pPr>
+        <w:rPr>
+          <w:b/>
+          <w:bCs/>
+          <w:color w:val="000000" w:themeColor="text1"/>
+        </w:rPr>
+      </w:pPr>
+    </w:p>
+    <w:p>
+      <w:pPr>
+        <w:rPr>
+          <w:b/>
+          <w:bCs/>
+          <w:color w:val="000000" w:themeColor="text1"/>
+        </w:rPr>
+      </w:pPr>
+      <w:r>
+        <w:rPr>
+          <w:b/>
+          <w:bCs/>
+          <w:color w:val="000000" w:themeColor="text1"/>
+        </w:rPr>
+        <w:t>--------------------------------------------------</w:t>
+      </w:r>
+    </w:p>
+    <w:p>
+      <w:pPr>
+        <w:rPr>
+          <w:b/>
+          <w:bCs/>
+          <w:color w:val="000000" w:themeColor="text1"/>
+        </w:rPr>
+      </w:pPr>
+    </w:p>
+    <w:p>
+      <w:pPr>
+        <w:rPr>
+          <w:b/>
+          <w:bCs/>
+          <w:color w:val="000000" w:themeColor="text1"/>
+        </w:rPr>
+      </w:pPr>
+      <w:r>
+        <w:rPr>
+          <w:b/>
+          <w:bCs/>
+          <w:color w:val="000000" w:themeColor="text1"/>
+        </w:rPr>
+        <w:t>Wrong</w:t>
+      </w:r>
+    </w:p>
+    <w:p>
+      <w:pPr>
+        <w:rPr>
+          <w:b/>
+          <w:bCs/>
+          <w:color w:val="000000" w:themeColor="text1"/>
+        </w:rPr>
+      </w:pPr>
+    </w:p>
+    <w:p>
+      <w:pPr>
+        <w:rPr>
+          <w:b/>
+          <w:bCs/>
+          <w:color w:val="000000" w:themeColor="text1"/>
+        </w:rPr>
+      </w:pPr>
+      <w:r>
+        <w:rPr>
+          <w:b/>
+          <w:bCs/>
+          <w:color w:val="000000" w:themeColor="text1"/>
+        </w:rPr>
+        <w:t>void test()</w:t>
+      </w:r>
+    </w:p>
+    <w:p>
+      <w:pPr>
+        <w:rPr>
+          <w:b/>
+          <w:bCs/>
+          <w:color w:val="000000" w:themeColor="text1"/>
+        </w:rPr>
+      </w:pPr>
+      <w:r>
+        <w:rPr>
+          <w:b/>
+          <w:bCs/>
+          <w:color w:val="000000" w:themeColor="text1"/>
+        </w:rPr>
+        <w:t>{</w:t>
+      </w:r>
+    </w:p>
+    <w:p>
+      <w:pPr>
+        <w:rPr>
+          <w:b/>
+          <w:bCs/>
+          <w:color w:val="000000" w:themeColor="text1"/>
+        </w:rPr>
+      </w:pPr>
+      <w:r>
+        <w:rPr>
+          <w:b/>
+          <w:bCs/>
+          <w:color w:val="000000" w:themeColor="text1"/>
+        </w:rPr>
+        <w:t xml:space="preserve">   await abc();</w:t>
+      </w:r>
+    </w:p>
+    <w:p>
+      <w:pPr>
+        <w:rPr>
+          <w:b/>
+          <w:bCs/>
+          <w:color w:val="000000" w:themeColor="text1"/>
+        </w:rPr>
+      </w:pPr>
+      <w:r>
+        <w:rPr>
+          <w:b/>
+          <w:bCs/>
+          <w:color w:val="000000" w:themeColor="text1"/>
+        </w:rPr>
+        <w:t>}</w:t>
+      </w:r>
+    </w:p>
+    <w:p>
+      <w:pPr>
+        <w:rPr>
+          <w:b/>
+          <w:bCs/>
+          <w:color w:val="000000" w:themeColor="text1"/>
+        </w:rPr>
+      </w:pPr>
+    </w:p>
+    <w:p>
+      <w:pPr>
+        <w:rPr>
+          <w:b/>
+          <w:bCs/>
+          <w:color w:val="000000" w:themeColor="text1"/>
+        </w:rPr>
+      </w:pPr>
+      <w:r>
+        <w:rPr>
+          <w:b/>
+          <w:bCs/>
+          <w:color w:val="000000" w:themeColor="text1"/>
+        </w:rPr>
+        <w:t>--------------------------------------------------</w:t>
+      </w:r>
+    </w:p>
+    <w:p>
+      <w:pPr>
+        <w:rPr>
+          <w:b/>
+          <w:bCs/>
+          <w:color w:val="000000" w:themeColor="text1"/>
+        </w:rPr>
+      </w:pPr>
+    </w:p>
+    <w:p>
+      <w:pPr>
+        <w:rPr>
+          <w:b/>
+          <w:bCs/>
+          <w:color w:val="000000" w:themeColor="text1"/>
+        </w:rPr>
+      </w:pPr>
+      <w:r>
+        <w:rPr>
+          <w:b/>
+          <w:bCs/>
+          <w:color w:val="000000" w:themeColor="text1"/>
+        </w:rPr>
+        <w:t>Correct</w:t>
+      </w:r>
+    </w:p>
+    <w:p>
+      <w:pPr>
+        <w:rPr>
+          <w:b/>
+          <w:bCs/>
+          <w:color w:val="000000" w:themeColor="text1"/>
+        </w:rPr>
+      </w:pPr>
+    </w:p>
+    <w:p>
+      <w:pPr>
+        <w:rPr>
+          <w:b/>
+          <w:bCs/>
+          <w:color w:val="000000" w:themeColor="text1"/>
+        </w:rPr>
+      </w:pPr>
+      <w:r>
+        <w:rPr>
+          <w:b/>
+          <w:bCs/>
+          <w:color w:val="000000" w:themeColor="text1"/>
+        </w:rPr>
+        <w:t>void test() async</w:t>
+      </w:r>
+    </w:p>
+    <w:p>
+      <w:pPr>
+        <w:rPr>
+          <w:b/>
+          <w:bCs/>
+          <w:color w:val="000000" w:themeColor="text1"/>
+        </w:rPr>
+      </w:pPr>
+      <w:r>
+        <w:rPr>
+          <w:b/>
+          <w:bCs/>
+          <w:color w:val="000000" w:themeColor="text1"/>
+        </w:rPr>
+        <w:t>{</w:t>
+      </w:r>
+    </w:p>
+    <w:p>
+      <w:pPr>
+        <w:rPr>
+          <w:b/>
+          <w:bCs/>
+          <w:color w:val="000000" w:themeColor="text1"/>
+        </w:rPr>
+      </w:pPr>
+      <w:r>
+        <w:rPr>
+          <w:b/>
+          <w:bCs/>
+          <w:color w:val="000000" w:themeColor="text1"/>
+        </w:rPr>
+        <w:t xml:space="preserve">   await abc();</w:t>
+      </w:r>
+    </w:p>
+    <w:p>
+      <w:pPr>
+        <w:rPr>
+          <w:b/>
+          <w:bCs/>
+          <w:color w:val="000000" w:themeColor="text1"/>
+        </w:rPr>
+      </w:pPr>
+      <w:r>
+        <w:rPr>
+          <w:b/>
+          <w:bCs/>
+          <w:color w:val="000000" w:themeColor="text1"/>
+        </w:rPr>
+        <w:t>}</w:t>
+      </w:r>
+    </w:p>
+    <w:p>
+      <w:pPr>
+        <w:rPr>
+          <w:b/>
+          <w:bCs/>
+          <w:color w:val="000000" w:themeColor="text1"/>
+        </w:rPr>
+      </w:pPr>
+    </w:p>
+    <w:p>
+      <w:pPr>
+        <w:rPr>
+          <w:b/>
+          <w:bCs/>
+          <w:color w:val="000000" w:themeColor="text1"/>
+        </w:rPr>
+      </w:pPr>
+      <w:r>
+        <w:rPr>
+          <w:b/>
+          <w:bCs/>
+          <w:color w:val="000000" w:themeColor="text1"/>
+        </w:rPr>
+        <w:t>--------------------------------------------------</w:t>
+      </w:r>
+    </w:p>
+    <w:p>
+      <w:pPr>
+        <w:rPr>
+          <w:b/>
+          <w:bCs/>
+          <w:color w:val="000000" w:themeColor="text1"/>
+        </w:rPr>
+      </w:pPr>
+    </w:p>
+    <w:p>
+      <w:pPr>
+        <w:rPr>
+          <w:b/>
+          <w:bCs/>
+          <w:color w:val="000000" w:themeColor="text1"/>
+        </w:rPr>
+      </w:pPr>
+      <w:r>
+        <w:rPr>
+          <w:b/>
+          <w:bCs/>
+          <w:color w:val="000000" w:themeColor="text1"/>
+        </w:rPr>
+        <w:t>Real Flutter Usage</w:t>
+      </w:r>
+    </w:p>
+    <w:p>
+      <w:pPr>
+        <w:rPr>
+          <w:b/>
+          <w:bCs/>
+          <w:color w:val="000000" w:themeColor="text1"/>
+        </w:rPr>
+      </w:pPr>
+    </w:p>
+    <w:p>
+      <w:pPr>
+        <w:rPr>
+          <w:b/>
+          <w:bCs/>
+          <w:color w:val="000000" w:themeColor="text1"/>
+        </w:rPr>
+      </w:pPr>
+      <w:r>
+        <w:rPr>
+          <w:b/>
+          <w:bCs/>
+          <w:color w:val="000000" w:themeColor="text1"/>
+        </w:rPr>
+        <w:lastRenderedPageBreak/>
+        <w:t>API Call</w:t>
+      </w:r>
+    </w:p>
+    <w:p>
+      <w:pPr>
+        <w:rPr>
+          <w:b/>
+          <w:bCs/>
+          <w:color w:val="000000" w:themeColor="text1"/>
+        </w:rPr>
+      </w:pPr>
+    </w:p>
+    <w:p>
+      <w:pPr>
+        <w:rPr>
+          <w:b/>
+          <w:bCs/>
+          <w:color w:val="000000" w:themeColor="text1"/>
+        </w:rPr>
+      </w:pPr>
+      <w:r>
+        <w:rPr>
+          <w:b/>
+          <w:bCs/>
+          <w:color w:val="000000" w:themeColor="text1"/>
+        </w:rPr>
+        <w:t>var data = await apiCall();</w:t>
+      </w:r>
+    </w:p>
+    <w:p>
+      <w:pPr>
+        <w:rPr>
+          <w:b/>
+          <w:bCs/>
+          <w:color w:val="000000" w:themeColor="text1"/>
+        </w:rPr>
+      </w:pPr>
+    </w:p>
+    <w:p>
+      <w:pPr>
+        <w:rPr>
+          <w:b/>
+          <w:bCs/>
+          <w:color w:val="000000" w:themeColor="text1"/>
+        </w:rPr>
+      </w:pPr>
+      <w:r>
+        <w:rPr>
+          <w:b/>
+          <w:bCs/>
+          <w:color w:val="000000" w:themeColor="text1"/>
+        </w:rPr>
+        <w:t>--------------------------------------------------</w:t>
+      </w:r>
+    </w:p>
+    <w:p>
+      <w:pPr>
+        <w:rPr>
+          <w:b/>
+          <w:bCs/>
+          <w:color w:val="000000" w:themeColor="text1"/>
+        </w:rPr>
+      </w:pPr>
+    </w:p>
+    <w:p>
+      <w:pPr>
+        <w:rPr>
+          <w:b/>
+          <w:bCs/>
+          <w:color w:val="000000" w:themeColor="text1"/>
+        </w:rPr>
+      </w:pPr>
+      <w:r>
+        <w:rPr>
+          <w:b/>
+          <w:bCs/>
+          <w:color w:val="000000" w:themeColor="text1"/>
+        </w:rPr>
+        <w:t>Firebase</w:t>
+      </w:r>
+    </w:p>
+    <w:p>
+      <w:pPr>
+        <w:rPr>
+          <w:b/>
+          <w:bCs/>
+          <w:color w:val="000000" w:themeColor="text1"/>
+        </w:rPr>
+      </w:pPr>
+    </w:p>
+    <w:p>
+      <w:pPr>
+        <w:rPr>
+          <w:b/>
+          <w:bCs/>
+          <w:color w:val="000000" w:themeColor="text1"/>
+        </w:rPr>
+      </w:pPr>
+      <w:r>
+        <w:rPr>
+          <w:b/>
+          <w:bCs/>
+          <w:color w:val="000000" w:themeColor="text1"/>
+        </w:rPr>
+        <w:t>await FirebaseAuth.instance.signIn();</w:t>
+      </w:r>
+    </w:p>
+    <w:p>
+      <w:pPr>
+        <w:rPr>
+          <w:b/>
+          <w:bCs/>
+          <w:color w:val="000000" w:themeColor="text1"/>
+        </w:rPr>
+      </w:pPr>
+    </w:p>
+    <w:p>
+      <w:pPr>
+        <w:rPr>
+          <w:b/>
+          <w:bCs/>
+          <w:color w:val="000000" w:themeColor="text1"/>
+        </w:rPr>
+      </w:pPr>
+      <w:r>
+        <w:rPr>
+          <w:b/>
+          <w:bCs/>
+          <w:color w:val="000000" w:themeColor="text1"/>
+        </w:rPr>
+        <w:t>--------------------------------------------------</w:t>
+      </w:r>
+    </w:p>
+    <w:p>
+      <w:pPr>
+        <w:rPr>
+          <w:b/>
+          <w:bCs/>
+          <w:color w:val="000000" w:themeColor="text1"/>
+        </w:rPr>
+      </w:pPr>
+    </w:p>
+    <w:p>
+      <w:pPr>
+        <w:rPr>
+          <w:b/>
+          <w:bCs/>
+          <w:color w:val="000000" w:themeColor="text1"/>
+        </w:rPr>
+      </w:pPr>
+      <w:r>
+        <w:rPr>
+          <w:b/>
+          <w:bCs/>
+          <w:color w:val="000000" w:themeColor="text1"/>
+        </w:rPr>
+        <w:t>Database</w:t>
+      </w:r>
+    </w:p>
+    <w:p>
+      <w:pPr>
+        <w:rPr>
+          <w:b/>
+          <w:bCs/>
+          <w:color w:val="000000" w:themeColor="text1"/>
+        </w:rPr>
+      </w:pPr>
+    </w:p>
+    <w:p>
+      <w:pPr>
+        <w:rPr>
+          <w:b/>
+          <w:bCs/>
+          <w:color w:val="000000" w:themeColor="text1"/>
+        </w:rPr>
+      </w:pPr>
+      <w:r>
+        <w:rPr>
+          <w:b/>
+          <w:bCs/>
+          <w:color w:val="000000" w:themeColor="text1"/>
+        </w:rPr>
+        <w:t>await db.insert();</w:t>
+      </w:r>
+    </w:p>
+    <w:p>
+      <w:pPr>
+        <w:rPr>
+          <w:b/>
+          <w:bCs/>
+          <w:color w:val="000000" w:themeColor="text1"/>
+        </w:rPr>
+      </w:pPr>
+    </w:p>
+    <w:p>
+      <w:pPr>
+        <w:rPr>
+          <w:b/>
+          <w:bCs/>
+          <w:color w:val="000000" w:themeColor="text1"/>
+        </w:rPr>
+      </w:pPr>
+      <w:r>
+        <w:rPr>
+          <w:b/>
+          <w:bCs/>
+          <w:color w:val="000000" w:themeColor="text1"/>
+        </w:rPr>
+        <w:t>--------------------------------------------------</w:t>
+      </w:r>
+    </w:p>
+    <w:p>
+      <w:pPr>
+        <w:rPr>
+          <w:b/>
+          <w:bCs/>
+          <w:color w:val="000000" w:themeColor="text1"/>
+        </w:rPr>
+      </w:pPr>
+    </w:p>
+    <w:p>
+      <w:pPr>
+        <w:rPr>
+          <w:b/>
+          <w:bCs/>
+          <w:color w:val="000000" w:themeColor="text1"/>
+        </w:rPr>
+      </w:pPr>
+      <w:r>
+        <w:rPr>
+          <w:b/>
+          <w:bCs/>
+          <w:color w:val="000000" w:themeColor="text1"/>
+        </w:rPr>
+        <w:t>Memory Trick</w:t>
+      </w:r>
+    </w:p>
+    <w:p>
+      <w:pPr>
+        <w:rPr>
+          <w:b/>
+          <w:bCs/>
+          <w:color w:val="000000" w:themeColor="text1"/>
+        </w:rPr>
+      </w:pPr>
+    </w:p>
+    <w:p>
+      <w:pPr>
+        <w:rPr>
+          <w:b/>
+          <w:bCs/>
+          <w:color w:val="000000" w:themeColor="text1"/>
+        </w:rPr>
+      </w:pPr>
+      <w:r>
+        <w:rPr>
+          <w:b/>
+          <w:bCs/>
+          <w:color w:val="000000" w:themeColor="text1"/>
+        </w:rPr>
+        <w:t>async</w:t>
+      </w:r>
+    </w:p>
+    <w:p>
+      <w:pPr>
+        <w:rPr>
+          <w:b/>
+          <w:bCs/>
+          <w:color w:val="000000" w:themeColor="text1"/>
+        </w:rPr>
+      </w:pPr>
+      <w:r>
+        <w:rPr>
+          <w:b/>
+          <w:bCs/>
+          <w:color w:val="000000" w:themeColor="text1"/>
+        </w:rPr>
+        <w:t>- kaam me time lagega</w:t>
+      </w:r>
+    </w:p>
+    <w:p>
+      <w:pPr>
+        <w:rPr>
+          <w:b/>
+          <w:bCs/>
+          <w:color w:val="000000" w:themeColor="text1"/>
+        </w:rPr>
+      </w:pPr>
+    </w:p>
+    <w:p>
+      <w:pPr>
+        <w:rPr>
+          <w:b/>
+          <w:bCs/>
+          <w:color w:val="000000" w:themeColor="text1"/>
+        </w:rPr>
+      </w:pPr>
+      <w:r>
+        <w:rPr>
+          <w:b/>
+          <w:bCs/>
+          <w:color w:val="000000" w:themeColor="text1"/>
+        </w:rPr>
+        <w:t>await</w:t>
+      </w:r>
+    </w:p>
+    <w:p>
+      <w:pPr>
+        <w:rPr>
+          <w:b/>
+          <w:bCs/>
+          <w:color w:val="000000" w:themeColor="text1"/>
+        </w:rPr>
+      </w:pPr>
+      <w:r>
+        <w:rPr>
+          <w:b/>
+          <w:bCs/>
+          <w:color w:val="000000" w:themeColor="text1"/>
+        </w:rPr>
+        <w:t>- ruk jao</w:t>
+      </w:r>
+    </w:p>
+    <w:p>
+      <w:pPr>
+        <w:rPr>
+          <w:b/>
+          <w:bCs/>
+          <w:color w:val="000000" w:themeColor="text1"/>
+        </w:rPr>
+      </w:pPr>
+    </w:p>
+    <w:p>
+      <w:pPr>
+        <w:rPr>
+          <w:b/>
+          <w:bCs/>
+          <w:color w:val="000000" w:themeColor="text1"/>
+        </w:rPr>
+      </w:pPr>
+      <w:r>
+        <w:rPr>
+          <w:b/>
+          <w:bCs/>
+          <w:color w:val="000000" w:themeColor="text1"/>
+        </w:rPr>
+        <w:lastRenderedPageBreak/>
+        <w:t>Future</w:t>
+      </w:r>
+    </w:p>
+    <w:p>
+      <w:pPr>
+        <w:rPr>
+          <w:b/>
+          <w:bCs/>
+          <w:color w:val="000000" w:themeColor="text1"/>
+        </w:rPr>
+      </w:pPr>
+      <w:r>
+        <w:rPr>
+          <w:b/>
+          <w:bCs/>
+          <w:color w:val="000000" w:themeColor="text1"/>
+        </w:rPr>
+        <w:t>- value baad me milegi</w:t>
+      </w:r>
     </w:p>
     <w:p>
       <w:pPr>
@@ -4181,7 +5197,6 @@
   <w:style w:type="character" w:default="1" w:styleId="DefaultParagraphFont">
     <w:name w:val="Default Paragraph Font"/>
     <w:uiPriority w:val="1"/>
-    <w:semiHidden/>
     <w:unhideWhenUsed/>
   </w:style>
   <w:style w:type="table" w:default="1" w:styleId="TableNormal">

</xml_diff>